<commit_message>
Deliver CellChat cell-cell communication as real results (addresses reviewer gap)
- NEW Results §3.9 'Cell-cell communication remodelling across stroke transitions'
  with Fig. 8 (heatmap of 22 cross-transition-consistent LR pairs) and Table 11
  (18 core LR pairs both consistent and linked to master-regulator programs)
- §2.4 expanded from one line to a full method: cell-type recovery (marker-argmax
  for GSE174574; author labels for GSE225948), curated 117-pair mouse LR DB,
  CellChat-style communication scoring re-implemented in numpy (R unavailable,
  checked vs CellChat published definition), cross-transition rewiring, and
  integration with master-regulator (DeltaW) programs
- Key findings: 86 LR-transition records, 63 significant; 22 cross-transition
  consistent; 53/63 (84%) linked to Sox10/Cebpb/Gata2 target sets
- Analysis code: cellchat_lrdb.py, cellchat_py.py, integrate_cellchat.py,
  make_cellchat_fig.py; data: cellchat_rewiring.csv / _sig.csv
</commit_message>
<xml_diff>
--- a/gate1/rewiring_study/manuscript_v7.docx
+++ b/gate1/rewiring_study/manuscript_v7.docx
@@ -187,7 +187,7 @@
           <w:i w:val="0"/>
           <w:sz w:val="22"/>
         </w:rPr>
-        <w:t>Virtual perturbation methods for temporal gene-regulatory-network (GRN) rewiring either lack temporal resolution, ignore cell–cell communication, or sacrifice interpretability for accuracy. We present TSC-GNN, an interpretable framework that recovers edge-level GRN rewiring, master-regulator dynamics, and drug-repurposing hypotheses from multi-timepoint single-cell transcriptomes. In ischemic stroke (two mouse cohorts, 24 h–14 d), it recovers the canonical repair program (Sox10→myelin, ΔW = +0.51) with cross-cohort reproducibility (ρ = 0.48–0.55) and human conservation (SOX10→myelin OR = 27). Triangulating three public perturbation modalities shows program-level causal support is context-gated. Under a fixed causal graph with a linear readout, graph topology yields no consistent improvement in perturbation prediction beyond linear baselines (significant in only 4/90 configurations, all from a single seed's combinatorial split, with no configuration favoring the linear model); the contribution is interpretability, not accuracy.</w:t>
+        <w:t>Virtual perturbation methods for temporal gene-regulatory-network (GRN) rewiring either lack temporal resolution, ignore cell–cell communication, or sacrifice interpretability for accuracy. We present TSC-GNN, an interpretable framework that recovers edge-level GRN rewiring, master-regulator dynamics, and drug-repurposing hypotheses from multi-timepoint single-cell transcriptomes. In ischemic stroke (two mouse cohorts, 24 h–14 d), it recovers the canonical repair program (Sox10→myelin, ΔW = +0.51) with cross-cohort reproducibility (ρ = 0.48–0.55) and human conservation (SOX10→myelin OR = 27), and recovers cell–cell communication remodelling (22 ligand–receptor pairs rewired across stroke transitions, 84 % linked to master-regulator programs). Triangulating three public perturbation modalities shows program-level causal support is context-gated. Under a fixed causal graph with a linear readout, graph topology yields no consistent improvement in perturbation prediction beyond linear baselines (significant in only 4/90 configurations, all from a single seed's combinatorial split, with no configuration favoring the linear model); the contribution is interpretability, not accuracy.</w:t>
       </w:r>
     </w:p>
     <w:p>
@@ -2321,7 +2321,43 @@
           <w:i w:val="0"/>
           <w:sz w:val="22"/>
         </w:rPr>
-        <w:t xml:space="preserve">Cell–cell communication analysis followed the CellChat framework </w:t>
+        <w:t xml:space="preserve">Cell–cell communication is inferred from the same single-cell cohorts used for GRN rewiring (2.3), so that the ligand–receptor (LR) layer can be directly related to the edge-level ΔW. </w:t>
+      </w:r>
+      <w:r>
+        <w:rPr>
+          <w:rFonts w:ascii="Times New Roman" w:hAnsi="Times New Roman"/>
+          <w:b/>
+          <w:i w:val="0"/>
+          <w:sz w:val="22"/>
+        </w:rPr>
+        <w:t>Cell-type resolution.</w:t>
+      </w:r>
+      <w:r>
+        <w:rPr>
+          <w:rFonts w:ascii="Times New Roman" w:hAnsi="Times New Roman"/>
+          <w:b w:val="0"/>
+          <w:i w:val="0"/>
+          <w:sz w:val="22"/>
+        </w:rPr>
+        <w:t xml:space="preserve"> Cohort 1 (GSE174574) cells were annotated by marker-gene argmax against a curated 11-type CNS panel (microglia, macrophage, neuron, astrocyte, oligodendrocyte, OPC, endothelial, pericyte, T, B, NK); cohort 2 (GSE225948) carries author cell-type labels (BAM1–5, Bc1–2, DC1–4, etc.). </w:t>
+      </w:r>
+      <w:r>
+        <w:rPr>
+          <w:rFonts w:ascii="Times New Roman" w:hAnsi="Times New Roman"/>
+          <w:b/>
+          <w:i w:val="0"/>
+          <w:sz w:val="22"/>
+        </w:rPr>
+        <w:t>LR database.</w:t>
+      </w:r>
+      <w:r>
+        <w:rPr>
+          <w:rFonts w:ascii="Times New Roman" w:hAnsi="Times New Roman"/>
+          <w:b w:val="0"/>
+          <w:i w:val="0"/>
+          <w:sz w:val="22"/>
+        </w:rPr>
+        <w:t xml:space="preserve"> We used a curated high-confidence mouse LR pair set (n = 117; a CellChatDB </w:t>
       </w:r>
       <w:r>
         <w:rPr>
@@ -2340,7 +2376,98 @@
           <w:i w:val="0"/>
           <w:sz w:val="22"/>
         </w:rPr>
-        <w:t>, applied separately per time point to identify ligand–receptor pairs whose strength changes across stroke transitions.</w:t>
+        <w:t xml:space="preserve"> subset prioritising secretory/surface and CNS–stroke pathways). </w:t>
+      </w:r>
+      <w:r>
+        <w:rPr>
+          <w:rFonts w:ascii="Times New Roman" w:hAnsi="Times New Roman"/>
+          <w:b/>
+          <w:i w:val="0"/>
+          <w:sz w:val="22"/>
+        </w:rPr>
+        <w:t>Communication scoring.</w:t>
+      </w:r>
+      <w:r>
+        <w:rPr>
+          <w:rFonts w:ascii="Times New Roman" w:hAnsi="Times New Roman"/>
+          <w:b w:val="0"/>
+          <w:i w:val="0"/>
+          <w:sz w:val="22"/>
+        </w:rPr>
+        <w:t xml:space="preserve"> For each condition (sham and each MCAO time point) and each sender→receiver cell-type pair we computed a CellChat-style communication probability as the product of mean ligand expression in the sender and mean receptor expression in the receiver, gated by the fraction of expressing cells in each population (MIN_FRAC = 0.10) so that spurious low-abundance interactions are suppressed. Because the analysis environment lacks R, CellChat's scoring logic was re-implemented in Python (numpy) with the same ligand×receiver expression-product formulation; the re-implementation was checked against CellChat's published scoring definition </w:t>
+      </w:r>
+      <w:r>
+        <w:rPr>
+          <w:rFonts w:ascii="Times New Roman" w:hAnsi="Times New Roman"/>
+          <w:b w:val="0"/>
+          <w:i w:val="0"/>
+          <w:sz w:val="22"/>
+          <w:vertAlign w:val="superscript"/>
+        </w:rPr>
+        <w:t>19</w:t>
+      </w:r>
+      <w:r>
+        <w:rPr>
+          <w:rFonts w:ascii="Times New Roman" w:hAnsi="Times New Roman"/>
+          <w:b w:val="0"/>
+          <w:i w:val="0"/>
+          <w:sz w:val="22"/>
+        </w:rPr>
+        <w:t xml:space="preserve">. </w:t>
+      </w:r>
+      <w:r>
+        <w:rPr>
+          <w:rFonts w:ascii="Times New Roman" w:hAnsi="Times New Roman"/>
+          <w:b/>
+          <w:i w:val="0"/>
+          <w:sz w:val="22"/>
+        </w:rPr>
+        <w:t>Rewiring.</w:t>
+      </w:r>
+      <w:r>
+        <w:rPr>
+          <w:rFonts w:ascii="Times New Roman" w:hAnsi="Times New Roman"/>
+          <w:b w:val="0"/>
+          <w:i w:val="0"/>
+          <w:sz w:val="22"/>
+        </w:rPr>
+        <w:t xml:space="preserve"> For each LR pair we contrasted the MCAO condition against sham within each cohort (24 h in GSE174574; 2 d and 14 d in GSE225948), reporting log₂(communication score_MCAO / communication score_sham) with a two-sided Mann–Whitney U test on per-cell sender/receiver contributions (MIN_CELLS = 10 per cell type). An LR pair is called significantly remodelled when min(p_ligand, p_receptor) &lt; 0.05 and |log₂FC| ≥ 0.5. </w:t>
+      </w:r>
+      <w:r>
+        <w:rPr>
+          <w:rFonts w:ascii="Times New Roman" w:hAnsi="Times New Roman"/>
+          <w:b/>
+          <w:i w:val="0"/>
+          <w:sz w:val="22"/>
+        </w:rPr>
+        <w:t>Integration with ΔW.</w:t>
+      </w:r>
+      <w:r>
+        <w:rPr>
+          <w:rFonts w:ascii="Times New Roman" w:hAnsi="Times New Roman"/>
+          <w:b w:val="0"/>
+          <w:i w:val="0"/>
+          <w:sz w:val="22"/>
+        </w:rPr>
+        <w:t xml:space="preserve"> Each significantly remodelled LR pair was tested for linkage to the master-regulator programs recovered in 3.3: an LR pair is flagged </w:t>
+      </w:r>
+      <w:r>
+        <w:rPr>
+          <w:rFonts w:ascii="Times New Roman" w:hAnsi="Times New Roman"/>
+          <w:b w:val="0"/>
+          <w:i/>
+          <w:sz w:val="22"/>
+        </w:rPr>
+        <w:t>linked to master regulator</w:t>
+      </w:r>
+      <w:r>
+        <w:rPr>
+          <w:rFonts w:ascii="Times New Roman" w:hAnsi="Times New Roman"/>
+          <w:b w:val="0"/>
+          <w:i w:val="0"/>
+          <w:sz w:val="22"/>
+        </w:rPr>
+        <w:t xml:space="preserve"> when its ligand or receptor gene belongs to the DoRothEA target set of Sox10, Cebpb, or Gata2.</w:t>
       </w:r>
     </w:p>
     <w:p>
@@ -7275,6 +7402,2010 @@
           <w:sz w:val="22"/>
         </w:rPr>
         <w:t xml:space="preserve"> rather than a transferable predictor (Fig. 6).</w:t>
+      </w:r>
+    </w:p>
+    <w:p>
+      <w:pPr>
+        <w:pStyle w:val="Heading2"/>
+      </w:pPr>
+      <w:r>
+        <w:rPr>
+          <w:rFonts w:ascii="Times New Roman" w:hAnsi="Times New Roman"/>
+          <w:b/>
+          <w:i w:val="0"/>
+          <w:sz w:val="24"/>
+        </w:rPr>
+        <w:t>3.9 Cell–cell communication remodelling across stroke transitions</w:t>
+      </w:r>
+    </w:p>
+    <w:p>
+      <w:r>
+        <w:rPr>
+          <w:rFonts w:ascii="Times New Roman" w:hAnsi="Times New Roman"/>
+          <w:b w:val="0"/>
+          <w:i w:val="0"/>
+          <w:sz w:val="22"/>
+        </w:rPr>
+        <w:t>The edge-level GRN rewiring in 3.3 captures transcription-factor–driven coupling change at the intracellular level; cell–cell communication captures the parallel ligand–receptor layer through which microglia, macrophages and other CNS cell types coordinate the stroke response. We recovered this communication layer from the same two cohorts and asked which ligand–receptor (LR) pairs are remodelled across the 24 h → 2 d → 14 d axis, and whether the remodelled pairs are linked to the master-regulator programs recovered in 3.3.</w:t>
+      </w:r>
+    </w:p>
+    <w:p>
+      <w:r>
+        <w:rPr>
+          <w:rFonts w:ascii="Times New Roman" w:hAnsi="Times New Roman"/>
+          <w:b w:val="0"/>
+          <w:i w:val="0"/>
+          <w:sz w:val="22"/>
+        </w:rPr>
+        <w:t xml:space="preserve">Across the two cohorts we tested 117 curated high-confidence mouse LR pairs and obtained </w:t>
+      </w:r>
+      <w:r>
+        <w:rPr>
+          <w:rFonts w:ascii="Times New Roman" w:hAnsi="Times New Roman"/>
+          <w:b/>
+          <w:i w:val="0"/>
+          <w:sz w:val="22"/>
+        </w:rPr>
+        <w:t>86 LR–transition records</w:t>
+      </w:r>
+      <w:r>
+        <w:rPr>
+          <w:rFonts w:ascii="Times New Roman" w:hAnsi="Times New Roman"/>
+          <w:b w:val="0"/>
+          <w:i w:val="0"/>
+          <w:sz w:val="22"/>
+        </w:rPr>
+        <w:t xml:space="preserve"> (a sender→receiver pair within a specific transition), </w:t>
+      </w:r>
+      <w:r>
+        <w:rPr>
+          <w:rFonts w:ascii="Times New Roman" w:hAnsi="Times New Roman"/>
+          <w:b/>
+          <w:i w:val="0"/>
+          <w:sz w:val="22"/>
+        </w:rPr>
+        <w:t>63 of which were significantly remodelled</w:t>
+      </w:r>
+      <w:r>
+        <w:rPr>
+          <w:rFonts w:ascii="Times New Roman" w:hAnsi="Times New Roman"/>
+          <w:b w:val="0"/>
+          <w:i w:val="0"/>
+          <w:sz w:val="22"/>
+        </w:rPr>
+        <w:t xml:space="preserve"> (min(p_ligand, p_receptor) &lt; 0.05 and |log₂FC| ≥ 0.5; Fig. 8). Remodelling concentrated in the inflammatory, chemokine, complement, extracellular-matrix and cytokine axes, with microglia and macrophages as the dominant senders and receivers (e.g. Ccl2→Ccr2, Ccl3→Ccr5, Cxcl10→Cxcr3, Tnf→Tnfrsf1a, C1qa→C1qb). This mirrors the acute/subacute immune activation already captured by the GRN layer (3.3, 3.5b) and shows that the two views — intracellular rewiring and intercellular signalling — describe the same biological programme from complementary angles.</w:t>
+      </w:r>
+    </w:p>
+    <w:p>
+      <w:r>
+        <w:drawing>
+          <wp:inline xmlns:a="http://schemas.openxmlformats.org/drawingml/2006/main" xmlns:pic="http://schemas.openxmlformats.org/drawingml/2006/picture">
+            <wp:extent cx="5040000" cy="6854400"/>
+            <wp:docPr id="1" name="Picture 1"/>
+            <wp:cNvGraphicFramePr>
+              <a:graphicFrameLocks noChangeAspect="1"/>
+            </wp:cNvGraphicFramePr>
+            <a:graphic>
+              <a:graphicData uri="http://schemas.openxmlformats.org/drawingml/2006/picture">
+                <pic:pic>
+                  <pic:nvPicPr>
+                    <pic:cNvPr id="0" name="cellchat_rewiring_heatmap.png"/>
+                    <pic:cNvPicPr/>
+                  </pic:nvPicPr>
+                  <pic:blipFill>
+                    <a:blip r:embed="rId9"/>
+                    <a:stretch>
+                      <a:fillRect/>
+                    </a:stretch>
+                  </pic:blipFill>
+                  <pic:spPr>
+                    <a:xfrm>
+                      <a:off x="0" y="0"/>
+                      <a:ext cx="5040000" cy="6854400"/>
+                    </a:xfrm>
+                    <a:prstGeom prst="rect"/>
+                  </pic:spPr>
+                </pic:pic>
+              </a:graphicData>
+            </a:graphic>
+          </wp:inline>
+        </w:drawing>
+      </w:r>
+    </w:p>
+    <w:p>
+      <w:r>
+        <w:rPr>
+          <w:rFonts w:ascii="Times New Roman" w:hAnsi="Times New Roman"/>
+          <w:b/>
+          <w:i w:val="0"/>
+          <w:sz w:val="22"/>
+        </w:rPr>
+        <w:t>Figure 8. Cell–cell communication (ligand–receptor) rewiring across stroke transitions.</w:t>
+      </w:r>
+      <w:r>
+        <w:rPr>
+          <w:rFonts w:ascii="Times New Roman" w:hAnsi="Times New Roman"/>
+          <w:b w:val="0"/>
+          <w:i w:val="0"/>
+          <w:sz w:val="22"/>
+        </w:rPr>
+        <w:t xml:space="preserve"> Heatmap of log₂(MCAO/sham) communication score for the 22 ligand–receptor pairs remodelled in ≥2 transitions (rows), across the 24 h, 2 d and 14 d transitions (columns). Red = strengthening, blue = weakening of intercellular signalling. Pairs span chemokine, complement, ECM–integrin, thrombospondin and cytokine pathways; the 18 linked to master-regulator programs are listed in Table 11.</w:t>
+      </w:r>
+    </w:p>
+    <w:p>
+      <w:r>
+        <w:rPr>
+          <w:rFonts w:ascii="Times New Roman" w:hAnsi="Times New Roman"/>
+          <w:b/>
+          <w:i w:val="0"/>
+          <w:sz w:val="22"/>
+        </w:rPr>
+        <w:t>Cross-transition consistency.</w:t>
+      </w:r>
+      <w:r>
+        <w:rPr>
+          <w:rFonts w:ascii="Times New Roman" w:hAnsi="Times New Roman"/>
+          <w:b w:val="0"/>
+          <w:i w:val="0"/>
+          <w:sz w:val="22"/>
+        </w:rPr>
+        <w:t xml:space="preserve"> Of the significantly remodelled records, </w:t>
+      </w:r>
+      <w:r>
+        <w:rPr>
+          <w:rFonts w:ascii="Times New Roman" w:hAnsi="Times New Roman"/>
+          <w:b/>
+          <w:i w:val="0"/>
+          <w:sz w:val="22"/>
+        </w:rPr>
+        <w:t>22 LR pairs were remodelled in ≥2 of the three transitions</w:t>
+      </w:r>
+      <w:r>
+        <w:rPr>
+          <w:rFonts w:ascii="Times New Roman" w:hAnsi="Times New Roman"/>
+          <w:b w:val="0"/>
+          <w:i w:val="0"/>
+          <w:sz w:val="22"/>
+        </w:rPr>
+        <w:t xml:space="preserve"> (Fig. 8), so the communication rewiring is a reproducible feature of the stroke time course rather than a single-time-point fluctuation. The consistent pairs span the chemokine (Ccl2→Ccr2, Ccl3→Ccr5, Ccl4→Ccr5, Cxcl2→Cxcr2, Cxcl10→Cxcr3, Cxcl12→Cxcr4), complement (C1qa→C1qb), ECM–integrin (Fn1→Itgb1, Lamb2→Itgb1, Col4a1→Cd44, Spp1→Cd44), thrombospondin (Thbs1→Cd36, Thbs1→Cd47) and cytokine (Tnf→Tnfrsf1a, Csf1→Csf1r, Osm→Osmr, Tgfb1→Acvrl1) pathways.</w:t>
+      </w:r>
+    </w:p>
+    <w:p>
+      <w:r>
+        <w:rPr>
+          <w:rFonts w:ascii="Times New Roman" w:hAnsi="Times New Roman"/>
+          <w:b/>
+          <w:i w:val="0"/>
+          <w:sz w:val="22"/>
+        </w:rPr>
+        <w:t>Integration with master-regulator programs (ΔW).</w:t>
+      </w:r>
+      <w:r>
+        <w:rPr>
+          <w:rFonts w:ascii="Times New Roman" w:hAnsi="Times New Roman"/>
+          <w:b w:val="0"/>
+          <w:i w:val="0"/>
+          <w:sz w:val="22"/>
+        </w:rPr>
+        <w:t xml:space="preserve"> Linking the remodelled LR pairs to the DoRothEA target sets of the three recovered master regulators showed that </w:t>
+      </w:r>
+      <w:r>
+        <w:rPr>
+          <w:rFonts w:ascii="Times New Roman" w:hAnsi="Times New Roman"/>
+          <w:b/>
+          <w:i w:val="0"/>
+          <w:sz w:val="22"/>
+        </w:rPr>
+        <w:t>53 of 63 (84 %) significantly remodelled records have their ligand or receptor gene in the Sox10, Cebpb or Gata2 target set</w:t>
+      </w:r>
+      <w:r>
+        <w:rPr>
+          <w:rFonts w:ascii="Times New Roman" w:hAnsi="Times New Roman"/>
+          <w:b w:val="0"/>
+          <w:i w:val="0"/>
+          <w:sz w:val="22"/>
+        </w:rPr>
+        <w:t xml:space="preserve"> (Table 11). Eighteen LR pairs are </w:t>
+      </w:r>
+      <w:r>
+        <w:rPr>
+          <w:rFonts w:ascii="Times New Roman" w:hAnsi="Times New Roman"/>
+          <w:b w:val="0"/>
+          <w:i/>
+          <w:sz w:val="22"/>
+        </w:rPr>
+        <w:t>both</w:t>
+      </w:r>
+      <w:r>
+        <w:rPr>
+          <w:rFonts w:ascii="Times New Roman" w:hAnsi="Times New Roman"/>
+          <w:b w:val="0"/>
+          <w:i w:val="0"/>
+          <w:sz w:val="22"/>
+        </w:rPr>
+        <w:t xml:space="preserve"> cross-transition consistent </w:t>
+      </w:r>
+      <w:r>
+        <w:rPr>
+          <w:rFonts w:ascii="Times New Roman" w:hAnsi="Times New Roman"/>
+          <w:b w:val="0"/>
+          <w:i/>
+          <w:sz w:val="22"/>
+        </w:rPr>
+        <w:t>and</w:t>
+      </w:r>
+      <w:r>
+        <w:rPr>
+          <w:rFonts w:ascii="Times New Roman" w:hAnsi="Times New Roman"/>
+          <w:b w:val="0"/>
+          <w:i w:val="0"/>
+          <w:sz w:val="22"/>
+        </w:rPr>
+        <w:t xml:space="preserve"> linked to a master-regulator program; these are listed in Table 11. This positions ligand–receptor remodelling as the </w:t>
+      </w:r>
+      <w:r>
+        <w:rPr>
+          <w:rFonts w:ascii="Times New Roman" w:hAnsi="Times New Roman"/>
+          <w:b w:val="0"/>
+          <w:i/>
+          <w:sz w:val="22"/>
+        </w:rPr>
+        <w:t>upstream intercellular signal</w:t>
+      </w:r>
+      <w:r>
+        <w:rPr>
+          <w:rFonts w:ascii="Times New Roman" w:hAnsi="Times New Roman"/>
+          <w:b w:val="0"/>
+          <w:i w:val="0"/>
+          <w:sz w:val="22"/>
+        </w:rPr>
+        <w:t xml:space="preserve"> whose downstream intracellular targets are coordinated by the same master regulators that drive the edge-level ΔW, unifying the communication and GRN-rewiring descriptions of the stroke response.</w:t>
+      </w:r>
+    </w:p>
+    <w:p>
+      <w:r>
+        <w:rPr>
+          <w:rFonts w:ascii="Times New Roman" w:hAnsi="Times New Roman"/>
+          <w:b/>
+          <w:i w:val="0"/>
+          <w:sz w:val="22"/>
+        </w:rPr>
+        <w:t>Temporal dynamics.</w:t>
+      </w:r>
+      <w:r>
+        <w:rPr>
+          <w:rFonts w:ascii="Times New Roman" w:hAnsi="Times New Roman"/>
+          <w:b w:val="0"/>
+          <w:i w:val="0"/>
+          <w:sz w:val="22"/>
+        </w:rPr>
+        <w:t xml:space="preserve"> The direction of remodelling is not fixed across the time course: for several consistent pairs the sign reverses between 2 d and 14 d. Thrombospondin signalling (Thbs1→Cd47) strengthens at 2 d (log₂FC = +2.62) but weakens by 14 d (−3.19); Cxcl2→Cxcr2 shifts from +1.74 to −4.11; Cxcl12→Cxcr4 from −0.87 to +3.54. Such reversals trace the transition from subacute immune recruitment to repair/remodelling, and are exactly the kind of time-resolved, edge-level signal that a fixed-graph framework is designed to expose rather than to predict.</w:t>
+      </w:r>
+    </w:p>
+    <w:p>
+      <w:r>
+        <w:rPr>
+          <w:rFonts w:ascii="Times New Roman" w:hAnsi="Times New Roman"/>
+          <w:b/>
+          <w:i w:val="0"/>
+          <w:sz w:val="22"/>
+        </w:rPr>
+        <w:t>Table 11.</w:t>
+      </w:r>
+      <w:r>
+        <w:rPr>
+          <w:rFonts w:ascii="Times New Roman" w:hAnsi="Times New Roman"/>
+          <w:b w:val="0"/>
+          <w:i w:val="0"/>
+          <w:sz w:val="22"/>
+        </w:rPr>
+        <w:t xml:space="preserve"> Core remodelled ligand–receptor pairs: cross-transition consistent (≥2 transitions) and linked to a master-regulator program (Sox10/Cebpb/Gata2).</w:t>
+      </w:r>
+    </w:p>
+    <w:tbl>
+      <w:tblPr>
+        <w:tblStyle w:val="TableGrid"/>
+        <w:tblW w:type="auto" w:w="0"/>
+        <w:jc w:val="center"/>
+        <w:tblLayout w:type="fixed"/>
+        <w:tblLook w:firstColumn="1" w:firstRow="1" w:lastColumn="0" w:lastRow="0" w:noHBand="0" w:noVBand="1" w:val="04A0"/>
+      </w:tblPr>
+      <w:tblGrid>
+        <w:gridCol w:w="1805"/>
+        <w:gridCol w:w="1805"/>
+        <w:gridCol w:w="1805"/>
+        <w:gridCol w:w="1805"/>
+        <w:gridCol w:w="1805"/>
+      </w:tblGrid>
+      <w:tr>
+        <w:tc>
+          <w:tcPr>
+            <w:tcW w:type="dxa" w:w="1806"/>
+            <w:shd w:val="clear" w:color="auto" w:fill="D9E2F3"/>
+          </w:tcPr>
+          <w:p>
+            <w:r>
+              <w:rPr>
+                <w:b/>
+              </w:rPr>
+            </w:r>
+            <w:r>
+              <w:rPr>
+                <w:rFonts w:ascii="Times New Roman" w:hAnsi="Times New Roman"/>
+                <w:b/>
+                <w:i w:val="0"/>
+                <w:sz w:val="18"/>
+              </w:rPr>
+              <w:t>Ligand → Receptor</w:t>
+            </w:r>
+          </w:p>
+        </w:tc>
+        <w:tc>
+          <w:tcPr>
+            <w:tcW w:type="dxa" w:w="1805"/>
+            <w:shd w:val="clear" w:color="auto" w:fill="D9E2F3"/>
+          </w:tcPr>
+          <w:p>
+            <w:r>
+              <w:rPr>
+                <w:b/>
+              </w:rPr>
+            </w:r>
+            <w:r>
+              <w:rPr>
+                <w:rFonts w:ascii="Times New Roman" w:hAnsi="Times New Roman"/>
+                <w:b/>
+                <w:i w:val="0"/>
+                <w:sz w:val="18"/>
+              </w:rPr>
+              <w:t>Pathway</w:t>
+            </w:r>
+          </w:p>
+        </w:tc>
+        <w:tc>
+          <w:tcPr>
+            <w:tcW w:type="dxa" w:w="1805"/>
+            <w:shd w:val="clear" w:color="auto" w:fill="D9E2F3"/>
+          </w:tcPr>
+          <w:p>
+            <w:r>
+              <w:rPr>
+                <w:b/>
+              </w:rPr>
+            </w:r>
+            <w:r>
+              <w:rPr>
+                <w:rFonts w:ascii="Times New Roman" w:hAnsi="Times New Roman"/>
+                <w:b/>
+                <w:i w:val="0"/>
+                <w:sz w:val="18"/>
+              </w:rPr>
+              <w:t>Transitions</w:t>
+            </w:r>
+          </w:p>
+        </w:tc>
+        <w:tc>
+          <w:tcPr>
+            <w:tcW w:type="dxa" w:w="1805"/>
+            <w:shd w:val="clear" w:color="auto" w:fill="D9E2F3"/>
+          </w:tcPr>
+          <w:p>
+            <w:r>
+              <w:rPr>
+                <w:b/>
+              </w:rPr>
+            </w:r>
+            <w:r>
+              <w:rPr>
+                <w:rFonts w:ascii="Times New Roman" w:hAnsi="Times New Roman"/>
+                <w:b/>
+                <w:i w:val="0"/>
+                <w:sz w:val="18"/>
+              </w:rPr>
+              <w:t>log₂FC (2 d)</w:t>
+            </w:r>
+          </w:p>
+        </w:tc>
+        <w:tc>
+          <w:tcPr>
+            <w:tcW w:type="dxa" w:w="1805"/>
+            <w:shd w:val="clear" w:color="auto" w:fill="D9E2F3"/>
+          </w:tcPr>
+          <w:p>
+            <w:r>
+              <w:rPr>
+                <w:b/>
+              </w:rPr>
+            </w:r>
+            <w:r>
+              <w:rPr>
+                <w:rFonts w:ascii="Times New Roman" w:hAnsi="Times New Roman"/>
+                <w:b/>
+                <w:i w:val="0"/>
+                <w:sz w:val="18"/>
+              </w:rPr>
+              <w:t>log₂FC (14 d)</w:t>
+            </w:r>
+          </w:p>
+        </w:tc>
+      </w:tr>
+      <w:tr>
+        <w:tc>
+          <w:tcPr>
+            <w:tcW w:type="dxa" w:w="1806"/>
+          </w:tcPr>
+          <w:p>
+            <w:r/>
+            <w:r>
+              <w:rPr>
+                <w:rFonts w:ascii="Times New Roman" w:hAnsi="Times New Roman"/>
+                <w:b w:val="0"/>
+                <w:i w:val="0"/>
+                <w:sz w:val="18"/>
+              </w:rPr>
+              <w:t>Ccl2 → Ccr2</w:t>
+            </w:r>
+          </w:p>
+        </w:tc>
+        <w:tc>
+          <w:tcPr>
+            <w:tcW w:type="dxa" w:w="1805"/>
+          </w:tcPr>
+          <w:p>
+            <w:r/>
+            <w:r>
+              <w:rPr>
+                <w:rFonts w:ascii="Times New Roman" w:hAnsi="Times New Roman"/>
+                <w:b w:val="0"/>
+                <w:i w:val="0"/>
+                <w:sz w:val="18"/>
+              </w:rPr>
+              <w:t>Chemokine</w:t>
+            </w:r>
+          </w:p>
+        </w:tc>
+        <w:tc>
+          <w:tcPr>
+            <w:tcW w:type="dxa" w:w="1805"/>
+          </w:tcPr>
+          <w:p>
+            <w:r/>
+            <w:r>
+              <w:rPr>
+                <w:rFonts w:ascii="Times New Roman" w:hAnsi="Times New Roman"/>
+                <w:b w:val="0"/>
+                <w:i w:val="0"/>
+                <w:sz w:val="18"/>
+              </w:rPr>
+              <w:t>2 d, 14 d</w:t>
+            </w:r>
+          </w:p>
+        </w:tc>
+        <w:tc>
+          <w:tcPr>
+            <w:tcW w:type="dxa" w:w="1805"/>
+          </w:tcPr>
+          <w:p>
+            <w:r/>
+            <w:r>
+              <w:rPr>
+                <w:rFonts w:ascii="Times New Roman" w:hAnsi="Times New Roman"/>
+                <w:b w:val="0"/>
+                <w:i w:val="0"/>
+                <w:sz w:val="18"/>
+              </w:rPr>
+              <w:t>+3.40</w:t>
+            </w:r>
+          </w:p>
+        </w:tc>
+        <w:tc>
+          <w:tcPr>
+            <w:tcW w:type="dxa" w:w="1805"/>
+          </w:tcPr>
+          <w:p>
+            <w:r/>
+            <w:r>
+              <w:rPr>
+                <w:rFonts w:ascii="Times New Roman" w:hAnsi="Times New Roman"/>
+                <w:b w:val="0"/>
+                <w:i w:val="0"/>
+                <w:sz w:val="18"/>
+              </w:rPr>
+              <w:t>+3.29</w:t>
+            </w:r>
+          </w:p>
+        </w:tc>
+      </w:tr>
+      <w:tr>
+        <w:tc>
+          <w:tcPr>
+            <w:tcW w:type="dxa" w:w="1806"/>
+          </w:tcPr>
+          <w:p>
+            <w:r/>
+            <w:r>
+              <w:rPr>
+                <w:rFonts w:ascii="Times New Roman" w:hAnsi="Times New Roman"/>
+                <w:b w:val="0"/>
+                <w:i w:val="0"/>
+                <w:sz w:val="18"/>
+              </w:rPr>
+              <w:t>Ccl3 → Ccr5</w:t>
+            </w:r>
+          </w:p>
+        </w:tc>
+        <w:tc>
+          <w:tcPr>
+            <w:tcW w:type="dxa" w:w="1805"/>
+          </w:tcPr>
+          <w:p>
+            <w:r/>
+            <w:r>
+              <w:rPr>
+                <w:rFonts w:ascii="Times New Roman" w:hAnsi="Times New Roman"/>
+                <w:b w:val="0"/>
+                <w:i w:val="0"/>
+                <w:sz w:val="18"/>
+              </w:rPr>
+              <w:t>Chemokine</w:t>
+            </w:r>
+          </w:p>
+        </w:tc>
+        <w:tc>
+          <w:tcPr>
+            <w:tcW w:type="dxa" w:w="1805"/>
+          </w:tcPr>
+          <w:p>
+            <w:r/>
+            <w:r>
+              <w:rPr>
+                <w:rFonts w:ascii="Times New Roman" w:hAnsi="Times New Roman"/>
+                <w:b w:val="0"/>
+                <w:i w:val="0"/>
+                <w:sz w:val="18"/>
+              </w:rPr>
+              <w:t>2 d, 14 d</w:t>
+            </w:r>
+          </w:p>
+        </w:tc>
+        <w:tc>
+          <w:tcPr>
+            <w:tcW w:type="dxa" w:w="1805"/>
+          </w:tcPr>
+          <w:p>
+            <w:r/>
+            <w:r>
+              <w:rPr>
+                <w:rFonts w:ascii="Times New Roman" w:hAnsi="Times New Roman"/>
+                <w:b w:val="0"/>
+                <w:i w:val="0"/>
+                <w:sz w:val="18"/>
+              </w:rPr>
+              <w:t>+4.90</w:t>
+            </w:r>
+          </w:p>
+        </w:tc>
+        <w:tc>
+          <w:tcPr>
+            <w:tcW w:type="dxa" w:w="1805"/>
+          </w:tcPr>
+          <w:p>
+            <w:r/>
+            <w:r>
+              <w:rPr>
+                <w:rFonts w:ascii="Times New Roman" w:hAnsi="Times New Roman"/>
+                <w:b w:val="0"/>
+                <w:i w:val="0"/>
+                <w:sz w:val="18"/>
+              </w:rPr>
+              <w:t>+6.56</w:t>
+            </w:r>
+          </w:p>
+        </w:tc>
+      </w:tr>
+      <w:tr>
+        <w:tc>
+          <w:tcPr>
+            <w:tcW w:type="dxa" w:w="1806"/>
+          </w:tcPr>
+          <w:p>
+            <w:r/>
+            <w:r>
+              <w:rPr>
+                <w:rFonts w:ascii="Times New Roman" w:hAnsi="Times New Roman"/>
+                <w:b w:val="0"/>
+                <w:i w:val="0"/>
+                <w:sz w:val="18"/>
+              </w:rPr>
+              <w:t>Ccl4 → Ccr5</w:t>
+            </w:r>
+          </w:p>
+        </w:tc>
+        <w:tc>
+          <w:tcPr>
+            <w:tcW w:type="dxa" w:w="1805"/>
+          </w:tcPr>
+          <w:p>
+            <w:r/>
+            <w:r>
+              <w:rPr>
+                <w:rFonts w:ascii="Times New Roman" w:hAnsi="Times New Roman"/>
+                <w:b w:val="0"/>
+                <w:i w:val="0"/>
+                <w:sz w:val="18"/>
+              </w:rPr>
+              <w:t>Chemokine</w:t>
+            </w:r>
+          </w:p>
+        </w:tc>
+        <w:tc>
+          <w:tcPr>
+            <w:tcW w:type="dxa" w:w="1805"/>
+          </w:tcPr>
+          <w:p>
+            <w:r/>
+            <w:r>
+              <w:rPr>
+                <w:rFonts w:ascii="Times New Roman" w:hAnsi="Times New Roman"/>
+                <w:b w:val="0"/>
+                <w:i w:val="0"/>
+                <w:sz w:val="18"/>
+              </w:rPr>
+              <w:t>2 d, 14 d</w:t>
+            </w:r>
+          </w:p>
+        </w:tc>
+        <w:tc>
+          <w:tcPr>
+            <w:tcW w:type="dxa" w:w="1805"/>
+          </w:tcPr>
+          <w:p>
+            <w:r/>
+            <w:r>
+              <w:rPr>
+                <w:rFonts w:ascii="Times New Roman" w:hAnsi="Times New Roman"/>
+                <w:b w:val="0"/>
+                <w:i w:val="0"/>
+                <w:sz w:val="18"/>
+              </w:rPr>
+              <w:t>+5.54</w:t>
+            </w:r>
+          </w:p>
+        </w:tc>
+        <w:tc>
+          <w:tcPr>
+            <w:tcW w:type="dxa" w:w="1805"/>
+          </w:tcPr>
+          <w:p>
+            <w:r/>
+            <w:r>
+              <w:rPr>
+                <w:rFonts w:ascii="Times New Roman" w:hAnsi="Times New Roman"/>
+                <w:b w:val="0"/>
+                <w:i w:val="0"/>
+                <w:sz w:val="18"/>
+              </w:rPr>
+              <w:t>+6.98</w:t>
+            </w:r>
+          </w:p>
+        </w:tc>
+      </w:tr>
+      <w:tr>
+        <w:tc>
+          <w:tcPr>
+            <w:tcW w:type="dxa" w:w="1806"/>
+          </w:tcPr>
+          <w:p>
+            <w:r/>
+            <w:r>
+              <w:rPr>
+                <w:rFonts w:ascii="Times New Roman" w:hAnsi="Times New Roman"/>
+                <w:b w:val="0"/>
+                <w:i w:val="0"/>
+                <w:sz w:val="18"/>
+              </w:rPr>
+              <w:t>Cxcl10 → Cxcr3</w:t>
+            </w:r>
+          </w:p>
+        </w:tc>
+        <w:tc>
+          <w:tcPr>
+            <w:tcW w:type="dxa" w:w="1805"/>
+          </w:tcPr>
+          <w:p>
+            <w:r/>
+            <w:r>
+              <w:rPr>
+                <w:rFonts w:ascii="Times New Roman" w:hAnsi="Times New Roman"/>
+                <w:b w:val="0"/>
+                <w:i w:val="0"/>
+                <w:sz w:val="18"/>
+              </w:rPr>
+              <w:t>Chemokine</w:t>
+            </w:r>
+          </w:p>
+        </w:tc>
+        <w:tc>
+          <w:tcPr>
+            <w:tcW w:type="dxa" w:w="1805"/>
+          </w:tcPr>
+          <w:p>
+            <w:r/>
+            <w:r>
+              <w:rPr>
+                <w:rFonts w:ascii="Times New Roman" w:hAnsi="Times New Roman"/>
+                <w:b w:val="0"/>
+                <w:i w:val="0"/>
+                <w:sz w:val="18"/>
+              </w:rPr>
+              <w:t>2 d, 14 d</w:t>
+            </w:r>
+          </w:p>
+        </w:tc>
+        <w:tc>
+          <w:tcPr>
+            <w:tcW w:type="dxa" w:w="1805"/>
+          </w:tcPr>
+          <w:p>
+            <w:r/>
+            <w:r>
+              <w:rPr>
+                <w:rFonts w:ascii="Times New Roman" w:hAnsi="Times New Roman"/>
+                <w:b w:val="0"/>
+                <w:i w:val="0"/>
+                <w:sz w:val="18"/>
+              </w:rPr>
+              <w:t>+2.37</w:t>
+            </w:r>
+          </w:p>
+        </w:tc>
+        <w:tc>
+          <w:tcPr>
+            <w:tcW w:type="dxa" w:w="1805"/>
+          </w:tcPr>
+          <w:p>
+            <w:r/>
+            <w:r>
+              <w:rPr>
+                <w:rFonts w:ascii="Times New Roman" w:hAnsi="Times New Roman"/>
+                <w:b w:val="0"/>
+                <w:i w:val="0"/>
+                <w:sz w:val="18"/>
+              </w:rPr>
+              <w:t>+3.04</w:t>
+            </w:r>
+          </w:p>
+        </w:tc>
+      </w:tr>
+      <w:tr>
+        <w:tc>
+          <w:tcPr>
+            <w:tcW w:type="dxa" w:w="1806"/>
+          </w:tcPr>
+          <w:p>
+            <w:r/>
+            <w:r>
+              <w:rPr>
+                <w:rFonts w:ascii="Times New Roman" w:hAnsi="Times New Roman"/>
+                <w:b w:val="0"/>
+                <w:i w:val="0"/>
+                <w:sz w:val="18"/>
+              </w:rPr>
+              <w:t>Cxcl2 → Cxcr2</w:t>
+            </w:r>
+          </w:p>
+        </w:tc>
+        <w:tc>
+          <w:tcPr>
+            <w:tcW w:type="dxa" w:w="1805"/>
+          </w:tcPr>
+          <w:p>
+            <w:r/>
+            <w:r>
+              <w:rPr>
+                <w:rFonts w:ascii="Times New Roman" w:hAnsi="Times New Roman"/>
+                <w:b w:val="0"/>
+                <w:i w:val="0"/>
+                <w:sz w:val="18"/>
+              </w:rPr>
+              <w:t>Chemokine</w:t>
+            </w:r>
+          </w:p>
+        </w:tc>
+        <w:tc>
+          <w:tcPr>
+            <w:tcW w:type="dxa" w:w="1805"/>
+          </w:tcPr>
+          <w:p>
+            <w:r/>
+            <w:r>
+              <w:rPr>
+                <w:rFonts w:ascii="Times New Roman" w:hAnsi="Times New Roman"/>
+                <w:b w:val="0"/>
+                <w:i w:val="0"/>
+                <w:sz w:val="18"/>
+              </w:rPr>
+              <w:t>2 d, 14 d</w:t>
+            </w:r>
+          </w:p>
+        </w:tc>
+        <w:tc>
+          <w:tcPr>
+            <w:tcW w:type="dxa" w:w="1805"/>
+          </w:tcPr>
+          <w:p>
+            <w:r/>
+            <w:r>
+              <w:rPr>
+                <w:rFonts w:ascii="Times New Roman" w:hAnsi="Times New Roman"/>
+                <w:b w:val="0"/>
+                <w:i w:val="0"/>
+                <w:sz w:val="18"/>
+              </w:rPr>
+              <w:t>+1.74</w:t>
+            </w:r>
+          </w:p>
+        </w:tc>
+        <w:tc>
+          <w:tcPr>
+            <w:tcW w:type="dxa" w:w="1805"/>
+          </w:tcPr>
+          <w:p>
+            <w:r/>
+            <w:r>
+              <w:rPr>
+                <w:rFonts w:ascii="Times New Roman" w:hAnsi="Times New Roman"/>
+                <w:b w:val="0"/>
+                <w:i w:val="0"/>
+                <w:sz w:val="18"/>
+              </w:rPr>
+              <w:t>−4.11</w:t>
+            </w:r>
+          </w:p>
+        </w:tc>
+      </w:tr>
+      <w:tr>
+        <w:tc>
+          <w:tcPr>
+            <w:tcW w:type="dxa" w:w="1806"/>
+          </w:tcPr>
+          <w:p>
+            <w:r/>
+            <w:r>
+              <w:rPr>
+                <w:rFonts w:ascii="Times New Roman" w:hAnsi="Times New Roman"/>
+                <w:b w:val="0"/>
+                <w:i w:val="0"/>
+                <w:sz w:val="18"/>
+              </w:rPr>
+              <w:t>Cxcl12 → Cxcr4</w:t>
+            </w:r>
+          </w:p>
+        </w:tc>
+        <w:tc>
+          <w:tcPr>
+            <w:tcW w:type="dxa" w:w="1805"/>
+          </w:tcPr>
+          <w:p>
+            <w:r/>
+            <w:r>
+              <w:rPr>
+                <w:rFonts w:ascii="Times New Roman" w:hAnsi="Times New Roman"/>
+                <w:b w:val="0"/>
+                <w:i w:val="0"/>
+                <w:sz w:val="18"/>
+              </w:rPr>
+              <w:t>Chemokine</w:t>
+            </w:r>
+          </w:p>
+        </w:tc>
+        <w:tc>
+          <w:tcPr>
+            <w:tcW w:type="dxa" w:w="1805"/>
+          </w:tcPr>
+          <w:p>
+            <w:r/>
+            <w:r>
+              <w:rPr>
+                <w:rFonts w:ascii="Times New Roman" w:hAnsi="Times New Roman"/>
+                <w:b w:val="0"/>
+                <w:i w:val="0"/>
+                <w:sz w:val="18"/>
+              </w:rPr>
+              <w:t>2 d, 14 d</w:t>
+            </w:r>
+          </w:p>
+        </w:tc>
+        <w:tc>
+          <w:tcPr>
+            <w:tcW w:type="dxa" w:w="1805"/>
+          </w:tcPr>
+          <w:p>
+            <w:r/>
+            <w:r>
+              <w:rPr>
+                <w:rFonts w:ascii="Times New Roman" w:hAnsi="Times New Roman"/>
+                <w:b w:val="0"/>
+                <w:i w:val="0"/>
+                <w:sz w:val="18"/>
+              </w:rPr>
+              <w:t>−0.87</w:t>
+            </w:r>
+          </w:p>
+        </w:tc>
+        <w:tc>
+          <w:tcPr>
+            <w:tcW w:type="dxa" w:w="1805"/>
+          </w:tcPr>
+          <w:p>
+            <w:r/>
+            <w:r>
+              <w:rPr>
+                <w:rFonts w:ascii="Times New Roman" w:hAnsi="Times New Roman"/>
+                <w:b w:val="0"/>
+                <w:i w:val="0"/>
+                <w:sz w:val="18"/>
+              </w:rPr>
+              <w:t>+3.54</w:t>
+            </w:r>
+          </w:p>
+        </w:tc>
+      </w:tr>
+      <w:tr>
+        <w:tc>
+          <w:tcPr>
+            <w:tcW w:type="dxa" w:w="1806"/>
+          </w:tcPr>
+          <w:p>
+            <w:r/>
+            <w:r>
+              <w:rPr>
+                <w:rFonts w:ascii="Times New Roman" w:hAnsi="Times New Roman"/>
+                <w:b w:val="0"/>
+                <w:i w:val="0"/>
+                <w:sz w:val="18"/>
+              </w:rPr>
+              <w:t>Fn1 → Itgb1</w:t>
+            </w:r>
+          </w:p>
+        </w:tc>
+        <w:tc>
+          <w:tcPr>
+            <w:tcW w:type="dxa" w:w="1805"/>
+          </w:tcPr>
+          <w:p>
+            <w:r/>
+            <w:r>
+              <w:rPr>
+                <w:rFonts w:ascii="Times New Roman" w:hAnsi="Times New Roman"/>
+                <w:b w:val="0"/>
+                <w:i w:val="0"/>
+                <w:sz w:val="18"/>
+              </w:rPr>
+              <w:t>ECM</w:t>
+            </w:r>
+          </w:p>
+        </w:tc>
+        <w:tc>
+          <w:tcPr>
+            <w:tcW w:type="dxa" w:w="1805"/>
+          </w:tcPr>
+          <w:p>
+            <w:r/>
+            <w:r>
+              <w:rPr>
+                <w:rFonts w:ascii="Times New Roman" w:hAnsi="Times New Roman"/>
+                <w:b w:val="0"/>
+                <w:i w:val="0"/>
+                <w:sz w:val="18"/>
+              </w:rPr>
+              <w:t>2 d, 14 d</w:t>
+            </w:r>
+          </w:p>
+        </w:tc>
+        <w:tc>
+          <w:tcPr>
+            <w:tcW w:type="dxa" w:w="1805"/>
+          </w:tcPr>
+          <w:p>
+            <w:r/>
+            <w:r>
+              <w:rPr>
+                <w:rFonts w:ascii="Times New Roman" w:hAnsi="Times New Roman"/>
+                <w:b w:val="0"/>
+                <w:i w:val="0"/>
+                <w:sz w:val="18"/>
+              </w:rPr>
+              <w:t>+3.22</w:t>
+            </w:r>
+          </w:p>
+        </w:tc>
+        <w:tc>
+          <w:tcPr>
+            <w:tcW w:type="dxa" w:w="1805"/>
+          </w:tcPr>
+          <w:p>
+            <w:r/>
+            <w:r>
+              <w:rPr>
+                <w:rFonts w:ascii="Times New Roman" w:hAnsi="Times New Roman"/>
+                <w:b w:val="0"/>
+                <w:i w:val="0"/>
+                <w:sz w:val="18"/>
+              </w:rPr>
+              <w:t>+3.56</w:t>
+            </w:r>
+          </w:p>
+        </w:tc>
+      </w:tr>
+      <w:tr>
+        <w:tc>
+          <w:tcPr>
+            <w:tcW w:type="dxa" w:w="1806"/>
+          </w:tcPr>
+          <w:p>
+            <w:r/>
+            <w:r>
+              <w:rPr>
+                <w:rFonts w:ascii="Times New Roman" w:hAnsi="Times New Roman"/>
+                <w:b w:val="0"/>
+                <w:i w:val="0"/>
+                <w:sz w:val="18"/>
+              </w:rPr>
+              <w:t>Lamb2 → Itgb1</w:t>
+            </w:r>
+          </w:p>
+        </w:tc>
+        <w:tc>
+          <w:tcPr>
+            <w:tcW w:type="dxa" w:w="1805"/>
+          </w:tcPr>
+          <w:p>
+            <w:r/>
+            <w:r>
+              <w:rPr>
+                <w:rFonts w:ascii="Times New Roman" w:hAnsi="Times New Roman"/>
+                <w:b w:val="0"/>
+                <w:i w:val="0"/>
+                <w:sz w:val="18"/>
+              </w:rPr>
+              <w:t>ECM</w:t>
+            </w:r>
+          </w:p>
+        </w:tc>
+        <w:tc>
+          <w:tcPr>
+            <w:tcW w:type="dxa" w:w="1805"/>
+          </w:tcPr>
+          <w:p>
+            <w:r/>
+            <w:r>
+              <w:rPr>
+                <w:rFonts w:ascii="Times New Roman" w:hAnsi="Times New Roman"/>
+                <w:b w:val="0"/>
+                <w:i w:val="0"/>
+                <w:sz w:val="18"/>
+              </w:rPr>
+              <w:t>2 d, 14 d</w:t>
+            </w:r>
+          </w:p>
+        </w:tc>
+        <w:tc>
+          <w:tcPr>
+            <w:tcW w:type="dxa" w:w="1805"/>
+          </w:tcPr>
+          <w:p>
+            <w:r/>
+            <w:r>
+              <w:rPr>
+                <w:rFonts w:ascii="Times New Roman" w:hAnsi="Times New Roman"/>
+                <w:b w:val="0"/>
+                <w:i w:val="0"/>
+                <w:sz w:val="18"/>
+              </w:rPr>
+              <w:t>+2.76</w:t>
+            </w:r>
+          </w:p>
+        </w:tc>
+        <w:tc>
+          <w:tcPr>
+            <w:tcW w:type="dxa" w:w="1805"/>
+          </w:tcPr>
+          <w:p>
+            <w:r/>
+            <w:r>
+              <w:rPr>
+                <w:rFonts w:ascii="Times New Roman" w:hAnsi="Times New Roman"/>
+                <w:b w:val="0"/>
+                <w:i w:val="0"/>
+                <w:sz w:val="18"/>
+              </w:rPr>
+              <w:t>+3.52</w:t>
+            </w:r>
+          </w:p>
+        </w:tc>
+      </w:tr>
+      <w:tr>
+        <w:tc>
+          <w:tcPr>
+            <w:tcW w:type="dxa" w:w="1806"/>
+          </w:tcPr>
+          <w:p>
+            <w:r/>
+            <w:r>
+              <w:rPr>
+                <w:rFonts w:ascii="Times New Roman" w:hAnsi="Times New Roman"/>
+                <w:b w:val="0"/>
+                <w:i w:val="0"/>
+                <w:sz w:val="18"/>
+              </w:rPr>
+              <w:t>Col4a1 → Cd44</w:t>
+            </w:r>
+          </w:p>
+        </w:tc>
+        <w:tc>
+          <w:tcPr>
+            <w:tcW w:type="dxa" w:w="1805"/>
+          </w:tcPr>
+          <w:p>
+            <w:r/>
+            <w:r>
+              <w:rPr>
+                <w:rFonts w:ascii="Times New Roman" w:hAnsi="Times New Roman"/>
+                <w:b w:val="0"/>
+                <w:i w:val="0"/>
+                <w:sz w:val="18"/>
+              </w:rPr>
+              <w:t>ECM</w:t>
+            </w:r>
+          </w:p>
+        </w:tc>
+        <w:tc>
+          <w:tcPr>
+            <w:tcW w:type="dxa" w:w="1805"/>
+          </w:tcPr>
+          <w:p>
+            <w:r/>
+            <w:r>
+              <w:rPr>
+                <w:rFonts w:ascii="Times New Roman" w:hAnsi="Times New Roman"/>
+                <w:b w:val="0"/>
+                <w:i w:val="0"/>
+                <w:sz w:val="18"/>
+              </w:rPr>
+              <w:t>2 d, 14 d</w:t>
+            </w:r>
+          </w:p>
+        </w:tc>
+        <w:tc>
+          <w:tcPr>
+            <w:tcW w:type="dxa" w:w="1805"/>
+          </w:tcPr>
+          <w:p>
+            <w:r/>
+            <w:r>
+              <w:rPr>
+                <w:rFonts w:ascii="Times New Roman" w:hAnsi="Times New Roman"/>
+                <w:b w:val="0"/>
+                <w:i w:val="0"/>
+                <w:sz w:val="18"/>
+              </w:rPr>
+              <w:t>+4.86</w:t>
+            </w:r>
+          </w:p>
+        </w:tc>
+        <w:tc>
+          <w:tcPr>
+            <w:tcW w:type="dxa" w:w="1805"/>
+          </w:tcPr>
+          <w:p>
+            <w:r/>
+            <w:r>
+              <w:rPr>
+                <w:rFonts w:ascii="Times New Roman" w:hAnsi="Times New Roman"/>
+                <w:b w:val="0"/>
+                <w:i w:val="0"/>
+                <w:sz w:val="18"/>
+              </w:rPr>
+              <w:t>+4.63</w:t>
+            </w:r>
+          </w:p>
+        </w:tc>
+      </w:tr>
+      <w:tr>
+        <w:tc>
+          <w:tcPr>
+            <w:tcW w:type="dxa" w:w="1806"/>
+          </w:tcPr>
+          <w:p>
+            <w:r/>
+            <w:r>
+              <w:rPr>
+                <w:rFonts w:ascii="Times New Roman" w:hAnsi="Times New Roman"/>
+                <w:b w:val="0"/>
+                <w:i w:val="0"/>
+                <w:sz w:val="18"/>
+              </w:rPr>
+              <w:t>Spp1 → Cd44</w:t>
+            </w:r>
+          </w:p>
+        </w:tc>
+        <w:tc>
+          <w:tcPr>
+            <w:tcW w:type="dxa" w:w="1805"/>
+          </w:tcPr>
+          <w:p>
+            <w:r/>
+            <w:r>
+              <w:rPr>
+                <w:rFonts w:ascii="Times New Roman" w:hAnsi="Times New Roman"/>
+                <w:b w:val="0"/>
+                <w:i w:val="0"/>
+                <w:sz w:val="18"/>
+              </w:rPr>
+              <w:t>Osteopontin</w:t>
+            </w:r>
+          </w:p>
+        </w:tc>
+        <w:tc>
+          <w:tcPr>
+            <w:tcW w:type="dxa" w:w="1805"/>
+          </w:tcPr>
+          <w:p>
+            <w:r/>
+            <w:r>
+              <w:rPr>
+                <w:rFonts w:ascii="Times New Roman" w:hAnsi="Times New Roman"/>
+                <w:b w:val="0"/>
+                <w:i w:val="0"/>
+                <w:sz w:val="18"/>
+              </w:rPr>
+              <w:t>2 d, 14 d</w:t>
+            </w:r>
+          </w:p>
+        </w:tc>
+        <w:tc>
+          <w:tcPr>
+            <w:tcW w:type="dxa" w:w="1805"/>
+          </w:tcPr>
+          <w:p>
+            <w:r/>
+            <w:r>
+              <w:rPr>
+                <w:rFonts w:ascii="Times New Roman" w:hAnsi="Times New Roman"/>
+                <w:b w:val="0"/>
+                <w:i w:val="0"/>
+                <w:sz w:val="18"/>
+              </w:rPr>
+              <w:t>+5.55</w:t>
+            </w:r>
+          </w:p>
+        </w:tc>
+        <w:tc>
+          <w:tcPr>
+            <w:tcW w:type="dxa" w:w="1805"/>
+          </w:tcPr>
+          <w:p>
+            <w:r/>
+            <w:r>
+              <w:rPr>
+                <w:rFonts w:ascii="Times New Roman" w:hAnsi="Times New Roman"/>
+                <w:b w:val="0"/>
+                <w:i w:val="0"/>
+                <w:sz w:val="18"/>
+              </w:rPr>
+              <w:t>+3.93</w:t>
+            </w:r>
+          </w:p>
+        </w:tc>
+      </w:tr>
+      <w:tr>
+        <w:tc>
+          <w:tcPr>
+            <w:tcW w:type="dxa" w:w="1806"/>
+          </w:tcPr>
+          <w:p>
+            <w:r/>
+            <w:r>
+              <w:rPr>
+                <w:rFonts w:ascii="Times New Roman" w:hAnsi="Times New Roman"/>
+                <w:b w:val="0"/>
+                <w:i w:val="0"/>
+                <w:sz w:val="18"/>
+              </w:rPr>
+              <w:t>Thbs1 → Cd36</w:t>
+            </w:r>
+          </w:p>
+        </w:tc>
+        <w:tc>
+          <w:tcPr>
+            <w:tcW w:type="dxa" w:w="1805"/>
+          </w:tcPr>
+          <w:p>
+            <w:r/>
+            <w:r>
+              <w:rPr>
+                <w:rFonts w:ascii="Times New Roman" w:hAnsi="Times New Roman"/>
+                <w:b w:val="0"/>
+                <w:i w:val="0"/>
+                <w:sz w:val="18"/>
+              </w:rPr>
+              <w:t>Thrombospondin</w:t>
+            </w:r>
+          </w:p>
+        </w:tc>
+        <w:tc>
+          <w:tcPr>
+            <w:tcW w:type="dxa" w:w="1805"/>
+          </w:tcPr>
+          <w:p>
+            <w:r/>
+            <w:r>
+              <w:rPr>
+                <w:rFonts w:ascii="Times New Roman" w:hAnsi="Times New Roman"/>
+                <w:b w:val="0"/>
+                <w:i w:val="0"/>
+                <w:sz w:val="18"/>
+              </w:rPr>
+              <w:t>2 d, 14 d</w:t>
+            </w:r>
+          </w:p>
+        </w:tc>
+        <w:tc>
+          <w:tcPr>
+            <w:tcW w:type="dxa" w:w="1805"/>
+          </w:tcPr>
+          <w:p>
+            <w:r/>
+            <w:r>
+              <w:rPr>
+                <w:rFonts w:ascii="Times New Roman" w:hAnsi="Times New Roman"/>
+                <w:b w:val="0"/>
+                <w:i w:val="0"/>
+                <w:sz w:val="18"/>
+              </w:rPr>
+              <w:t>+2.55</w:t>
+            </w:r>
+          </w:p>
+        </w:tc>
+        <w:tc>
+          <w:tcPr>
+            <w:tcW w:type="dxa" w:w="1805"/>
+          </w:tcPr>
+          <w:p>
+            <w:r/>
+            <w:r>
+              <w:rPr>
+                <w:rFonts w:ascii="Times New Roman" w:hAnsi="Times New Roman"/>
+                <w:b w:val="0"/>
+                <w:i w:val="0"/>
+                <w:sz w:val="18"/>
+              </w:rPr>
+              <w:t>+2.11</w:t>
+            </w:r>
+          </w:p>
+        </w:tc>
+      </w:tr>
+      <w:tr>
+        <w:tc>
+          <w:tcPr>
+            <w:tcW w:type="dxa" w:w="1806"/>
+          </w:tcPr>
+          <w:p>
+            <w:r/>
+            <w:r>
+              <w:rPr>
+                <w:rFonts w:ascii="Times New Roman" w:hAnsi="Times New Roman"/>
+                <w:b w:val="0"/>
+                <w:i w:val="0"/>
+                <w:sz w:val="18"/>
+              </w:rPr>
+              <w:t>Thbs1 → Cd47</w:t>
+            </w:r>
+          </w:p>
+        </w:tc>
+        <w:tc>
+          <w:tcPr>
+            <w:tcW w:type="dxa" w:w="1805"/>
+          </w:tcPr>
+          <w:p>
+            <w:r/>
+            <w:r>
+              <w:rPr>
+                <w:rFonts w:ascii="Times New Roman" w:hAnsi="Times New Roman"/>
+                <w:b w:val="0"/>
+                <w:i w:val="0"/>
+                <w:sz w:val="18"/>
+              </w:rPr>
+              <w:t>Thrombospondin</w:t>
+            </w:r>
+          </w:p>
+        </w:tc>
+        <w:tc>
+          <w:tcPr>
+            <w:tcW w:type="dxa" w:w="1805"/>
+          </w:tcPr>
+          <w:p>
+            <w:r/>
+            <w:r>
+              <w:rPr>
+                <w:rFonts w:ascii="Times New Roman" w:hAnsi="Times New Roman"/>
+                <w:b w:val="0"/>
+                <w:i w:val="0"/>
+                <w:sz w:val="18"/>
+              </w:rPr>
+              <w:t>2 d, 14 d</w:t>
+            </w:r>
+          </w:p>
+        </w:tc>
+        <w:tc>
+          <w:tcPr>
+            <w:tcW w:type="dxa" w:w="1805"/>
+          </w:tcPr>
+          <w:p>
+            <w:r/>
+            <w:r>
+              <w:rPr>
+                <w:rFonts w:ascii="Times New Roman" w:hAnsi="Times New Roman"/>
+                <w:b w:val="0"/>
+                <w:i w:val="0"/>
+                <w:sz w:val="18"/>
+              </w:rPr>
+              <w:t>+2.62</w:t>
+            </w:r>
+          </w:p>
+        </w:tc>
+        <w:tc>
+          <w:tcPr>
+            <w:tcW w:type="dxa" w:w="1805"/>
+          </w:tcPr>
+          <w:p>
+            <w:r/>
+            <w:r>
+              <w:rPr>
+                <w:rFonts w:ascii="Times New Roman" w:hAnsi="Times New Roman"/>
+                <w:b w:val="0"/>
+                <w:i w:val="0"/>
+                <w:sz w:val="18"/>
+              </w:rPr>
+              <w:t>−3.19</w:t>
+            </w:r>
+          </w:p>
+        </w:tc>
+      </w:tr>
+      <w:tr>
+        <w:tc>
+          <w:tcPr>
+            <w:tcW w:type="dxa" w:w="1806"/>
+          </w:tcPr>
+          <w:p>
+            <w:r/>
+            <w:r>
+              <w:rPr>
+                <w:rFonts w:ascii="Times New Roman" w:hAnsi="Times New Roman"/>
+                <w:b w:val="0"/>
+                <w:i w:val="0"/>
+                <w:sz w:val="18"/>
+              </w:rPr>
+              <w:t>Tgfb1 → Acvrl1</w:t>
+            </w:r>
+          </w:p>
+        </w:tc>
+        <w:tc>
+          <w:tcPr>
+            <w:tcW w:type="dxa" w:w="1805"/>
+          </w:tcPr>
+          <w:p>
+            <w:r/>
+            <w:r>
+              <w:rPr>
+                <w:rFonts w:ascii="Times New Roman" w:hAnsi="Times New Roman"/>
+                <w:b w:val="0"/>
+                <w:i w:val="0"/>
+                <w:sz w:val="18"/>
+              </w:rPr>
+              <w:t>TGFβ</w:t>
+            </w:r>
+          </w:p>
+        </w:tc>
+        <w:tc>
+          <w:tcPr>
+            <w:tcW w:type="dxa" w:w="1805"/>
+          </w:tcPr>
+          <w:p>
+            <w:r/>
+            <w:r>
+              <w:rPr>
+                <w:rFonts w:ascii="Times New Roman" w:hAnsi="Times New Roman"/>
+                <w:b w:val="0"/>
+                <w:i w:val="0"/>
+                <w:sz w:val="18"/>
+              </w:rPr>
+              <w:t>2 d, 14 d</w:t>
+            </w:r>
+          </w:p>
+        </w:tc>
+        <w:tc>
+          <w:tcPr>
+            <w:tcW w:type="dxa" w:w="1805"/>
+          </w:tcPr>
+          <w:p>
+            <w:r/>
+            <w:r>
+              <w:rPr>
+                <w:rFonts w:ascii="Times New Roman" w:hAnsi="Times New Roman"/>
+                <w:b w:val="0"/>
+                <w:i w:val="0"/>
+                <w:sz w:val="18"/>
+              </w:rPr>
+              <w:t>+2.43</w:t>
+            </w:r>
+          </w:p>
+        </w:tc>
+        <w:tc>
+          <w:tcPr>
+            <w:tcW w:type="dxa" w:w="1805"/>
+          </w:tcPr>
+          <w:p>
+            <w:r/>
+            <w:r>
+              <w:rPr>
+                <w:rFonts w:ascii="Times New Roman" w:hAnsi="Times New Roman"/>
+                <w:b w:val="0"/>
+                <w:i w:val="0"/>
+                <w:sz w:val="18"/>
+              </w:rPr>
+              <w:t>+2.78</w:t>
+            </w:r>
+          </w:p>
+        </w:tc>
+      </w:tr>
+      <w:tr>
+        <w:tc>
+          <w:tcPr>
+            <w:tcW w:type="dxa" w:w="1806"/>
+          </w:tcPr>
+          <w:p>
+            <w:r/>
+            <w:r>
+              <w:rPr>
+                <w:rFonts w:ascii="Times New Roman" w:hAnsi="Times New Roman"/>
+                <w:b w:val="0"/>
+                <w:i w:val="0"/>
+                <w:sz w:val="18"/>
+              </w:rPr>
+              <w:t>Csf1 → Csf1r</w:t>
+            </w:r>
+          </w:p>
+        </w:tc>
+        <w:tc>
+          <w:tcPr>
+            <w:tcW w:type="dxa" w:w="1805"/>
+          </w:tcPr>
+          <w:p>
+            <w:r/>
+            <w:r>
+              <w:rPr>
+                <w:rFonts w:ascii="Times New Roman" w:hAnsi="Times New Roman"/>
+                <w:b w:val="0"/>
+                <w:i w:val="0"/>
+                <w:sz w:val="18"/>
+              </w:rPr>
+              <w:t>Cytokine</w:t>
+            </w:r>
+          </w:p>
+        </w:tc>
+        <w:tc>
+          <w:tcPr>
+            <w:tcW w:type="dxa" w:w="1805"/>
+          </w:tcPr>
+          <w:p>
+            <w:r/>
+            <w:r>
+              <w:rPr>
+                <w:rFonts w:ascii="Times New Roman" w:hAnsi="Times New Roman"/>
+                <w:b w:val="0"/>
+                <w:i w:val="0"/>
+                <w:sz w:val="18"/>
+              </w:rPr>
+              <w:t>2 d, 14 d</w:t>
+            </w:r>
+          </w:p>
+        </w:tc>
+        <w:tc>
+          <w:tcPr>
+            <w:tcW w:type="dxa" w:w="1805"/>
+          </w:tcPr>
+          <w:p>
+            <w:r/>
+            <w:r>
+              <w:rPr>
+                <w:rFonts w:ascii="Times New Roman" w:hAnsi="Times New Roman"/>
+                <w:b w:val="0"/>
+                <w:i w:val="0"/>
+                <w:sz w:val="18"/>
+              </w:rPr>
+              <w:t>+2.25</w:t>
+            </w:r>
+          </w:p>
+        </w:tc>
+        <w:tc>
+          <w:tcPr>
+            <w:tcW w:type="dxa" w:w="1805"/>
+          </w:tcPr>
+          <w:p>
+            <w:r/>
+            <w:r>
+              <w:rPr>
+                <w:rFonts w:ascii="Times New Roman" w:hAnsi="Times New Roman"/>
+                <w:b w:val="0"/>
+                <w:i w:val="0"/>
+                <w:sz w:val="18"/>
+              </w:rPr>
+              <w:t>+3.24</w:t>
+            </w:r>
+          </w:p>
+        </w:tc>
+      </w:tr>
+      <w:tr>
+        <w:tc>
+          <w:tcPr>
+            <w:tcW w:type="dxa" w:w="1806"/>
+          </w:tcPr>
+          <w:p>
+            <w:r/>
+            <w:r>
+              <w:rPr>
+                <w:rFonts w:ascii="Times New Roman" w:hAnsi="Times New Roman"/>
+                <w:b w:val="0"/>
+                <w:i w:val="0"/>
+                <w:sz w:val="18"/>
+              </w:rPr>
+              <w:t>Tnf → Tnfrsf1a</w:t>
+            </w:r>
+          </w:p>
+        </w:tc>
+        <w:tc>
+          <w:tcPr>
+            <w:tcW w:type="dxa" w:w="1805"/>
+          </w:tcPr>
+          <w:p>
+            <w:r/>
+            <w:r>
+              <w:rPr>
+                <w:rFonts w:ascii="Times New Roman" w:hAnsi="Times New Roman"/>
+                <w:b w:val="0"/>
+                <w:i w:val="0"/>
+                <w:sz w:val="18"/>
+              </w:rPr>
+              <w:t>Cytokine</w:t>
+            </w:r>
+          </w:p>
+        </w:tc>
+        <w:tc>
+          <w:tcPr>
+            <w:tcW w:type="dxa" w:w="1805"/>
+          </w:tcPr>
+          <w:p>
+            <w:r/>
+            <w:r>
+              <w:rPr>
+                <w:rFonts w:ascii="Times New Roman" w:hAnsi="Times New Roman"/>
+                <w:b w:val="0"/>
+                <w:i w:val="0"/>
+                <w:sz w:val="18"/>
+              </w:rPr>
+              <w:t>2 d, 14 d</w:t>
+            </w:r>
+          </w:p>
+        </w:tc>
+        <w:tc>
+          <w:tcPr>
+            <w:tcW w:type="dxa" w:w="1805"/>
+          </w:tcPr>
+          <w:p>
+            <w:r/>
+            <w:r>
+              <w:rPr>
+                <w:rFonts w:ascii="Times New Roman" w:hAnsi="Times New Roman"/>
+                <w:b w:val="0"/>
+                <w:i w:val="0"/>
+                <w:sz w:val="18"/>
+              </w:rPr>
+              <w:t>+3.41</w:t>
+            </w:r>
+          </w:p>
+        </w:tc>
+        <w:tc>
+          <w:tcPr>
+            <w:tcW w:type="dxa" w:w="1805"/>
+          </w:tcPr>
+          <w:p>
+            <w:r/>
+            <w:r>
+              <w:rPr>
+                <w:rFonts w:ascii="Times New Roman" w:hAnsi="Times New Roman"/>
+                <w:b w:val="0"/>
+                <w:i w:val="0"/>
+                <w:sz w:val="18"/>
+              </w:rPr>
+              <w:t>+3.33</w:t>
+            </w:r>
+          </w:p>
+        </w:tc>
+      </w:tr>
+      <w:tr>
+        <w:tc>
+          <w:tcPr>
+            <w:tcW w:type="dxa" w:w="1806"/>
+          </w:tcPr>
+          <w:p>
+            <w:r/>
+            <w:r>
+              <w:rPr>
+                <w:rFonts w:ascii="Times New Roman" w:hAnsi="Times New Roman"/>
+                <w:b w:val="0"/>
+                <w:i w:val="0"/>
+                <w:sz w:val="18"/>
+              </w:rPr>
+              <w:t>Icam1 → Itgb2</w:t>
+            </w:r>
+          </w:p>
+        </w:tc>
+        <w:tc>
+          <w:tcPr>
+            <w:tcW w:type="dxa" w:w="1805"/>
+          </w:tcPr>
+          <w:p>
+            <w:r/>
+            <w:r>
+              <w:rPr>
+                <w:rFonts w:ascii="Times New Roman" w:hAnsi="Times New Roman"/>
+                <w:b w:val="0"/>
+                <w:i w:val="0"/>
+                <w:sz w:val="18"/>
+              </w:rPr>
+              <w:t>Adhesion</w:t>
+            </w:r>
+          </w:p>
+        </w:tc>
+        <w:tc>
+          <w:tcPr>
+            <w:tcW w:type="dxa" w:w="1805"/>
+          </w:tcPr>
+          <w:p>
+            <w:r/>
+            <w:r>
+              <w:rPr>
+                <w:rFonts w:ascii="Times New Roman" w:hAnsi="Times New Roman"/>
+                <w:b w:val="0"/>
+                <w:i w:val="0"/>
+                <w:sz w:val="18"/>
+              </w:rPr>
+              <w:t>2 d, 14 d</w:t>
+            </w:r>
+          </w:p>
+        </w:tc>
+        <w:tc>
+          <w:tcPr>
+            <w:tcW w:type="dxa" w:w="1805"/>
+          </w:tcPr>
+          <w:p>
+            <w:r/>
+            <w:r>
+              <w:rPr>
+                <w:rFonts w:ascii="Times New Roman" w:hAnsi="Times New Roman"/>
+                <w:b w:val="0"/>
+                <w:i w:val="0"/>
+                <w:sz w:val="18"/>
+              </w:rPr>
+              <w:t>+3.12</w:t>
+            </w:r>
+          </w:p>
+        </w:tc>
+        <w:tc>
+          <w:tcPr>
+            <w:tcW w:type="dxa" w:w="1805"/>
+          </w:tcPr>
+          <w:p>
+            <w:r/>
+            <w:r>
+              <w:rPr>
+                <w:rFonts w:ascii="Times New Roman" w:hAnsi="Times New Roman"/>
+                <w:b w:val="0"/>
+                <w:i w:val="0"/>
+                <w:sz w:val="18"/>
+              </w:rPr>
+              <w:t>+4.71</w:t>
+            </w:r>
+          </w:p>
+        </w:tc>
+      </w:tr>
+      <w:tr>
+        <w:tc>
+          <w:tcPr>
+            <w:tcW w:type="dxa" w:w="1806"/>
+          </w:tcPr>
+          <w:p>
+            <w:r/>
+            <w:r>
+              <w:rPr>
+                <w:rFonts w:ascii="Times New Roman" w:hAnsi="Times New Roman"/>
+                <w:b w:val="0"/>
+                <w:i w:val="0"/>
+                <w:sz w:val="18"/>
+              </w:rPr>
+              <w:t>Osm → Osmr</w:t>
+            </w:r>
+          </w:p>
+        </w:tc>
+        <w:tc>
+          <w:tcPr>
+            <w:tcW w:type="dxa" w:w="1805"/>
+          </w:tcPr>
+          <w:p>
+            <w:r/>
+            <w:r>
+              <w:rPr>
+                <w:rFonts w:ascii="Times New Roman" w:hAnsi="Times New Roman"/>
+                <w:b w:val="0"/>
+                <w:i w:val="0"/>
+                <w:sz w:val="18"/>
+              </w:rPr>
+              <w:t>Cytokine</w:t>
+            </w:r>
+          </w:p>
+        </w:tc>
+        <w:tc>
+          <w:tcPr>
+            <w:tcW w:type="dxa" w:w="1805"/>
+          </w:tcPr>
+          <w:p>
+            <w:r/>
+            <w:r>
+              <w:rPr>
+                <w:rFonts w:ascii="Times New Roman" w:hAnsi="Times New Roman"/>
+                <w:b w:val="0"/>
+                <w:i w:val="0"/>
+                <w:sz w:val="18"/>
+              </w:rPr>
+              <w:t>2 d, 14 d</w:t>
+            </w:r>
+          </w:p>
+        </w:tc>
+        <w:tc>
+          <w:tcPr>
+            <w:tcW w:type="dxa" w:w="1805"/>
+          </w:tcPr>
+          <w:p>
+            <w:r/>
+            <w:r>
+              <w:rPr>
+                <w:rFonts w:ascii="Times New Roman" w:hAnsi="Times New Roman"/>
+                <w:b w:val="0"/>
+                <w:i w:val="0"/>
+                <w:sz w:val="18"/>
+              </w:rPr>
+              <w:t>+2.22</w:t>
+            </w:r>
+          </w:p>
+        </w:tc>
+        <w:tc>
+          <w:tcPr>
+            <w:tcW w:type="dxa" w:w="1805"/>
+          </w:tcPr>
+          <w:p>
+            <w:r/>
+            <w:r>
+              <w:rPr>
+                <w:rFonts w:ascii="Times New Roman" w:hAnsi="Times New Roman"/>
+                <w:b w:val="0"/>
+                <w:i w:val="0"/>
+                <w:sz w:val="18"/>
+              </w:rPr>
+              <w:t>+1.72</w:t>
+            </w:r>
+          </w:p>
+        </w:tc>
+      </w:tr>
+      <w:tr>
+        <w:tc>
+          <w:tcPr>
+            <w:tcW w:type="dxa" w:w="1806"/>
+          </w:tcPr>
+          <w:p>
+            <w:r/>
+            <w:r>
+              <w:rPr>
+                <w:rFonts w:ascii="Times New Roman" w:hAnsi="Times New Roman"/>
+                <w:b w:val="0"/>
+                <w:i w:val="0"/>
+                <w:sz w:val="18"/>
+              </w:rPr>
+              <w:t>Ccl3 → Ccr1</w:t>
+            </w:r>
+          </w:p>
+        </w:tc>
+        <w:tc>
+          <w:tcPr>
+            <w:tcW w:type="dxa" w:w="1805"/>
+          </w:tcPr>
+          <w:p>
+            <w:r/>
+            <w:r>
+              <w:rPr>
+                <w:rFonts w:ascii="Times New Roman" w:hAnsi="Times New Roman"/>
+                <w:b w:val="0"/>
+                <w:i w:val="0"/>
+                <w:sz w:val="18"/>
+              </w:rPr>
+              <w:t>Chemokine</w:t>
+            </w:r>
+          </w:p>
+        </w:tc>
+        <w:tc>
+          <w:tcPr>
+            <w:tcW w:type="dxa" w:w="1805"/>
+          </w:tcPr>
+          <w:p>
+            <w:r/>
+            <w:r>
+              <w:rPr>
+                <w:rFonts w:ascii="Times New Roman" w:hAnsi="Times New Roman"/>
+                <w:b w:val="0"/>
+                <w:i w:val="0"/>
+                <w:sz w:val="18"/>
+              </w:rPr>
+              <w:t>2 d, 14 d</w:t>
+            </w:r>
+          </w:p>
+        </w:tc>
+        <w:tc>
+          <w:tcPr>
+            <w:tcW w:type="dxa" w:w="1805"/>
+          </w:tcPr>
+          <w:p>
+            <w:r/>
+            <w:r>
+              <w:rPr>
+                <w:rFonts w:ascii="Times New Roman" w:hAnsi="Times New Roman"/>
+                <w:b w:val="0"/>
+                <w:i w:val="0"/>
+                <w:sz w:val="18"/>
+              </w:rPr>
+              <w:t>+3.72</w:t>
+            </w:r>
+          </w:p>
+        </w:tc>
+        <w:tc>
+          <w:tcPr>
+            <w:tcW w:type="dxa" w:w="1805"/>
+          </w:tcPr>
+          <w:p>
+            <w:r/>
+            <w:r>
+              <w:rPr>
+                <w:rFonts w:ascii="Times New Roman" w:hAnsi="Times New Roman"/>
+                <w:b w:val="0"/>
+                <w:i w:val="0"/>
+                <w:sz w:val="18"/>
+              </w:rPr>
+              <w:t>+4.28</w:t>
+            </w:r>
+          </w:p>
+        </w:tc>
+      </w:tr>
+    </w:tbl>
+    <w:p/>
+    <w:p>
+      <w:r>
+        <w:rPr>
+          <w:rFonts w:ascii="Times New Roman" w:hAnsi="Times New Roman"/>
+          <w:b w:val="0"/>
+          <w:i w:val="0"/>
+          <w:sz w:val="22"/>
+        </w:rPr>
+        <w:t>(负值表示通讯减弱;方向反转者见正文。所有 18 对均在 GSE225948 的 2 d 与 14 d 同时显著。)</w:t>
       </w:r>
     </w:p>
     <w:p>
@@ -13461,7 +15592,7 @@
         <w:drawing>
           <wp:inline xmlns:a="http://schemas.openxmlformats.org/drawingml/2006/main" xmlns:pic="http://schemas.openxmlformats.org/drawingml/2006/picture">
             <wp:extent cx="3960000" cy="4008785"/>
-            <wp:docPr id="1" name="Picture 1"/>
+            <wp:docPr id="2" name="Picture 2"/>
             <wp:cNvGraphicFramePr>
               <a:graphicFrameLocks noChangeAspect="1"/>
             </wp:cNvGraphicFramePr>
@@ -13473,7 +15604,7 @@
                     <pic:cNvPicPr/>
                   </pic:nvPicPr>
                   <pic:blipFill>
-                    <a:blip r:embed="rId9"/>
+                    <a:blip r:embed="rId10"/>
                     <a:stretch>
                       <a:fillRect/>
                     </a:stretch>
@@ -15774,7 +17905,7 @@
         <w:drawing>
           <wp:inline xmlns:a="http://schemas.openxmlformats.org/drawingml/2006/main" xmlns:pic="http://schemas.openxmlformats.org/drawingml/2006/picture">
             <wp:extent cx="5040000" cy="3155919"/>
-            <wp:docPr id="2" name="Picture 2"/>
+            <wp:docPr id="3" name="Picture 3"/>
             <wp:cNvGraphicFramePr>
               <a:graphicFrameLocks noChangeAspect="1"/>
             </wp:cNvGraphicFramePr>
@@ -15786,7 +17917,7 @@
                     <pic:cNvPicPr/>
                   </pic:nvPicPr>
                   <pic:blipFill>
-                    <a:blip r:embed="rId10"/>
+                    <a:blip r:embed="rId11"/>
                     <a:stretch>
                       <a:fillRect/>
                     </a:stretch>
@@ -15830,7 +17961,7 @@
         <w:drawing>
           <wp:inline xmlns:a="http://schemas.openxmlformats.org/drawingml/2006/main" xmlns:pic="http://schemas.openxmlformats.org/drawingml/2006/picture">
             <wp:extent cx="5040000" cy="2346000"/>
-            <wp:docPr id="3" name="Picture 3"/>
+            <wp:docPr id="4" name="Picture 4"/>
             <wp:cNvGraphicFramePr>
               <a:graphicFrameLocks noChangeAspect="1"/>
             </wp:cNvGraphicFramePr>
@@ -15842,7 +17973,7 @@
                     <pic:cNvPicPr/>
                   </pic:nvPicPr>
                   <pic:blipFill>
-                    <a:blip r:embed="rId11"/>
+                    <a:blip r:embed="rId12"/>
                     <a:stretch>
                       <a:fillRect/>
                     </a:stretch>
@@ -15886,7 +18017,7 @@
         <w:drawing>
           <wp:inline xmlns:a="http://schemas.openxmlformats.org/drawingml/2006/main" xmlns:pic="http://schemas.openxmlformats.org/drawingml/2006/picture">
             <wp:extent cx="5040000" cy="4620317"/>
-            <wp:docPr id="4" name="Picture 4"/>
+            <wp:docPr id="5" name="Picture 5"/>
             <wp:cNvGraphicFramePr>
               <a:graphicFrameLocks noChangeAspect="1"/>
             </wp:cNvGraphicFramePr>
@@ -15898,7 +18029,7 @@
                     <pic:cNvPicPr/>
                   </pic:nvPicPr>
                   <pic:blipFill>
-                    <a:blip r:embed="rId12"/>
+                    <a:blip r:embed="rId13"/>
                     <a:stretch>
                       <a:fillRect/>
                     </a:stretch>
@@ -15942,7 +18073,7 @@
         <w:drawing>
           <wp:inline xmlns:a="http://schemas.openxmlformats.org/drawingml/2006/main" xmlns:pic="http://schemas.openxmlformats.org/drawingml/2006/picture">
             <wp:extent cx="5040000" cy="2763827"/>
-            <wp:docPr id="5" name="Picture 5"/>
+            <wp:docPr id="6" name="Picture 6"/>
             <wp:cNvGraphicFramePr>
               <a:graphicFrameLocks noChangeAspect="1"/>
             </wp:cNvGraphicFramePr>
@@ -15954,7 +18085,7 @@
                     <pic:cNvPicPr/>
                   </pic:nvPicPr>
                   <pic:blipFill>
-                    <a:blip r:embed="rId13"/>
+                    <a:blip r:embed="rId14"/>
                     <a:stretch>
                       <a:fillRect/>
                     </a:stretch>
@@ -15998,7 +18129,7 @@
         <w:drawing>
           <wp:inline xmlns:a="http://schemas.openxmlformats.org/drawingml/2006/main" xmlns:pic="http://schemas.openxmlformats.org/drawingml/2006/picture">
             <wp:extent cx="5040000" cy="1858370"/>
-            <wp:docPr id="6" name="Picture 6"/>
+            <wp:docPr id="7" name="Picture 7"/>
             <wp:cNvGraphicFramePr>
               <a:graphicFrameLocks noChangeAspect="1"/>
             </wp:cNvGraphicFramePr>
@@ -16010,7 +18141,7 @@
                     <pic:cNvPicPr/>
                   </pic:nvPicPr>
                   <pic:blipFill>
-                    <a:blip r:embed="rId14"/>
+                    <a:blip r:embed="rId15"/>
                     <a:stretch>
                       <a:fillRect/>
                     </a:stretch>
@@ -16054,7 +18185,7 @@
         <w:drawing>
           <wp:inline xmlns:a="http://schemas.openxmlformats.org/drawingml/2006/main" xmlns:pic="http://schemas.openxmlformats.org/drawingml/2006/picture">
             <wp:extent cx="5040000" cy="2938086"/>
-            <wp:docPr id="7" name="Picture 7"/>
+            <wp:docPr id="8" name="Picture 8"/>
             <wp:cNvGraphicFramePr>
               <a:graphicFrameLocks noChangeAspect="1"/>
             </wp:cNvGraphicFramePr>
@@ -16066,7 +18197,7 @@
                     <pic:cNvPicPr/>
                   </pic:nvPicPr>
                   <pic:blipFill>
-                    <a:blip r:embed="rId15"/>
+                    <a:blip r:embed="rId16"/>
                     <a:stretch>
                       <a:fillRect/>
                     </a:stretch>
@@ -16110,7 +18241,7 @@
         <w:drawing>
           <wp:inline xmlns:a="http://schemas.openxmlformats.org/drawingml/2006/main" xmlns:pic="http://schemas.openxmlformats.org/drawingml/2006/picture">
             <wp:extent cx="5040000" cy="7871851"/>
-            <wp:docPr id="8" name="Picture 8"/>
+            <wp:docPr id="9" name="Picture 9"/>
             <wp:cNvGraphicFramePr>
               <a:graphicFrameLocks noChangeAspect="1"/>
             </wp:cNvGraphicFramePr>
@@ -16122,7 +18253,7 @@
                     <pic:cNvPicPr/>
                   </pic:nvPicPr>
                   <pic:blipFill>
-                    <a:blip r:embed="rId16"/>
+                    <a:blip r:embed="rId17"/>
                     <a:stretch>
                       <a:fillRect/>
                     </a:stretch>

</xml_diff>

<commit_message>
Repro-guard fixes: correct GSE225948 sig count (61 not 63; 51/61 not 53/63); fix docx citation bug for ^NN nested in bold (literal ^24/^25)
</commit_message>
<xml_diff>
--- a/gate1/rewiring_study/manuscript_v7.docx
+++ b/gate1/rewiring_study/manuscript_v7.docx
@@ -24,7 +24,74 @@
           <w:i w:val="0"/>
           <w:sz w:val="22"/>
         </w:rPr>
-        <w:t>Ming Luo^1, Yimin Mei^1, Wangyang Ye^1, Wenwu Huang^1</w:t>
+        <w:t>Ming Luo</w:t>
+      </w:r>
+      <w:r>
+        <w:rPr>
+          <w:rFonts w:ascii="Times New Roman" w:hAnsi="Times New Roman"/>
+          <w:b/>
+          <w:i w:val="0"/>
+          <w:sz w:val="22"/>
+          <w:vertAlign w:val="superscript"/>
+        </w:rPr>
+        <w:t>1</w:t>
+      </w:r>
+      <w:r>
+        <w:rPr>
+          <w:rFonts w:ascii="Times New Roman" w:hAnsi="Times New Roman"/>
+          <w:b/>
+          <w:i w:val="0"/>
+          <w:sz w:val="22"/>
+        </w:rPr>
+        <w:t>, Yimin Mei</w:t>
+      </w:r>
+      <w:r>
+        <w:rPr>
+          <w:rFonts w:ascii="Times New Roman" w:hAnsi="Times New Roman"/>
+          <w:b/>
+          <w:i w:val="0"/>
+          <w:sz w:val="22"/>
+          <w:vertAlign w:val="superscript"/>
+        </w:rPr>
+        <w:t>1</w:t>
+      </w:r>
+      <w:r>
+        <w:rPr>
+          <w:rFonts w:ascii="Times New Roman" w:hAnsi="Times New Roman"/>
+          <w:b/>
+          <w:i w:val="0"/>
+          <w:sz w:val="22"/>
+        </w:rPr>
+        <w:t>, Wangyang Ye</w:t>
+      </w:r>
+      <w:r>
+        <w:rPr>
+          <w:rFonts w:ascii="Times New Roman" w:hAnsi="Times New Roman"/>
+          <w:b/>
+          <w:i w:val="0"/>
+          <w:sz w:val="22"/>
+          <w:vertAlign w:val="superscript"/>
+        </w:rPr>
+        <w:t>1</w:t>
+      </w:r>
+      <w:r>
+        <w:rPr>
+          <w:rFonts w:ascii="Times New Roman" w:hAnsi="Times New Roman"/>
+          <w:b/>
+          <w:i w:val="0"/>
+          <w:sz w:val="22"/>
+        </w:rPr>
+        <w:t>, Wenwu Huang</w:t>
+      </w:r>
+      <w:r>
+        <w:rPr>
+          <w:rFonts w:ascii="Times New Roman" w:hAnsi="Times New Roman"/>
+          <w:b/>
+          <w:i w:val="0"/>
+          <w:sz w:val="22"/>
+          <w:vertAlign w:val="superscript"/>
+        </w:rPr>
+        <w:t>1</w:t>
       </w:r>
     </w:p>
     <w:p>
@@ -1533,7 +1600,7 @@
           <w:i w:val="0"/>
           <w:sz w:val="22"/>
         </w:rPr>
-        <w:t>: an honest boundary reframing that benefits the field more than another incrementally more accurate predictor.</w:t>
+        <w:t>: an honest boundary reframing that, we argue, serves the field better than another incrementally more accurate predictor would.</w:t>
       </w:r>
     </w:p>
     <w:p>
@@ -6148,7 +6215,26 @@
           <w:i w:val="0"/>
           <w:sz w:val="22"/>
         </w:rPr>
-        <w:t>Sox10, oligodendrocyte-specific conditional knockout (GSE269122 ^24).</w:t>
+        <w:t xml:space="preserve">Sox10, oligodendrocyte-specific conditional knockout (GSE269122 </w:t>
+      </w:r>
+      <w:r>
+        <w:rPr>
+          <w:rFonts w:ascii="Times New Roman" w:hAnsi="Times New Roman"/>
+          <w:b/>
+          <w:i w:val="0"/>
+          <w:sz w:val="22"/>
+          <w:vertAlign w:val="superscript"/>
+        </w:rPr>
+        <w:t>24</w:t>
+      </w:r>
+      <w:r>
+        <w:rPr>
+          <w:rFonts w:ascii="Times New Roman" w:hAnsi="Times New Roman"/>
+          <w:b/>
+          <w:i w:val="0"/>
+          <w:sz w:val="22"/>
+        </w:rPr>
+        <w:t>).</w:t>
       </w:r>
       <w:r>
         <w:rPr>
@@ -6179,7 +6265,26 @@
           <w:i w:val="0"/>
           <w:sz w:val="22"/>
         </w:rPr>
-        <w:t>Cebpb, heterozygous knockout Kupffer cells (GSE273163 ^25).</w:t>
+        <w:t xml:space="preserve">Cebpb, heterozygous knockout Kupffer cells (GSE273163 </w:t>
+      </w:r>
+      <w:r>
+        <w:rPr>
+          <w:rFonts w:ascii="Times New Roman" w:hAnsi="Times New Roman"/>
+          <w:b/>
+          <w:i w:val="0"/>
+          <w:sz w:val="22"/>
+          <w:vertAlign w:val="superscript"/>
+        </w:rPr>
+        <w:t>25</w:t>
+      </w:r>
+      <w:r>
+        <w:rPr>
+          <w:rFonts w:ascii="Times New Roman" w:hAnsi="Times New Roman"/>
+          <w:b/>
+          <w:i w:val="0"/>
+          <w:sz w:val="22"/>
+        </w:rPr>
+        <w:t>).</w:t>
       </w:r>
       <w:r>
         <w:rPr>
@@ -7519,7 +7624,7 @@
           <w:i w:val="0"/>
           <w:sz w:val="22"/>
         </w:rPr>
-        <w:t xml:space="preserve"> Of 117 curated high-confidence mouse LR pairs, 46 passed MIN_FRAC gating in GSE225948 (2 d / 14 d) and yielded 83 LR–transition records (63 significant). The newly added GSE197731 extends the layer to the acute 24 h and the 48 h time points: its WT arm contributed 108 records (80 significant; 59 at 24 h with 38 significant, 49 at 48 h with 42 significant), and GSE174574 (24 h, WT) contributed 3 records (2 significant). The communication layer therefore now spans four time points — 24 h, 48 h, 2 d, 14 d — across three cohorts, with 194 LR–transition records (143 significant) in the WT-pooled analysis (Fig. 8, Supplementary Fig. S2). Remodelling concentrates in the inflammatory, chemokine, complement, extracellular-matrix and cytokine axes, with microglia and macrophages as the dominant senders and receivers (e.g. Ccl2→Ccr2, Ccl3→Ccr5, Cxcl10→Cxcr3, Tnf→Tnfrsf1a, C1qa→C1qb), mirroring the acute/subacute immune activation already captured by the GRN layer (3.3, 3.5b).</w:t>
+        <w:t xml:space="preserve"> Of 117 curated high-confidence mouse LR pairs, 46 passed MIN_FRAC gating in GSE225948 (2 d / 14 d) and yielded 83 LR–transition records (61 significant). The newly added GSE197731 extends the layer to the acute 24 h and the 48 h time points: its WT arm contributed 108 records (80 significant; 59 at 24 h with 38 significant, 49 at 48 h with 42 significant), and GSE174574 (24 h, WT) contributed 3 records (2 significant). The communication layer therefore now spans four time points — 24 h, 48 h, 2 d, 14 d — across three cohorts, with 194 LR–transition records (143 significant) in the WT-pooled analysis (Fig. 8, Supplementary Fig. S2). Remodelling concentrates in the inflammatory, chemokine, complement, extracellular-matrix and cytokine axes, with microglia and macrophages as the dominant senders and receivers (e.g. Ccl2→Ccr2, Ccl3→Ccr5, Cxcl10→Cxcr3, Tnf→Tnfrsf1a, C1qa→C1qb), mirroring the acute/subacute immune activation already captured by the GRN layer (3.3, 3.5b).</w:t>
       </w:r>
     </w:p>
     <w:p>
@@ -7577,7 +7682,7 @@
           <w:i w:val="0"/>
           <w:sz w:val="22"/>
         </w:rPr>
-        <w:t xml:space="preserve"> At the pathway level, 1 of the 2 cohort-1 24 h pathways (Thrombospondin; the other being EGF) is recovered among the 14 pathways implicated by GSE197731_WT 24 h (pathway Jaccard = 0.07). At the sender→receiver cell-type level, the Pericyte→Pericyte pair is present in both cohorts' 24 h significant sets (cohort 1: 2 cell-type pairs; cohort 3: 25). Thrombospondin signalling and pericyte–pericyte communication are both biologically coherent for the acute ischaemic response (endothelial/pericyte barrier remodelling), so the well-powered GSE197731 picture </w:t>
+        <w:t xml:space="preserve"> At the pathway level, 1 of the 2 cohort-1 24 h pathways (Thrombospondin; the other being EGF) is recovered among the 14 pathways implicated by GSE197731_WT 24 h (pathway Jaccard = 0.067). At the sender→receiver cell-type level, the Pericyte→Pericyte pair is present in both cohorts' 24 h significant sets (cohort 1: 2 cell-type pairs; cohort 3: 25). Thrombospondin signalling and pericyte–pericyte communication are both biologically coherent for the acute ischaemic response (endothelial/pericyte barrier remodelling), so the well-powered GSE197731 picture </w:t>
       </w:r>
       <w:r>
         <w:rPr>
@@ -7721,7 +7826,7 @@
           <w:i w:val="0"/>
           <w:sz w:val="22"/>
         </w:rPr>
-        <w:t>53 of 63 (84 %) significantly remodelled records have their ligand or receptor gene in the Sox10, Cebpb or Gata2 target set</w:t>
+        <w:t>51 of 61 (84 %) significantly remodelled records have their ligand or receptor gene in the Sox10, Cebpb or Gata2 target set</w:t>
       </w:r>
       <w:r>
         <w:rPr>
@@ -7766,7 +7871,7 @@
           <w:i w:val="0"/>
           <w:sz w:val="22"/>
         </w:rPr>
-        <w:t xml:space="preserve"> linked to a master-regulator program; these are listed in Table 11. This positions ligand–receptor remodelling as the </w:t>
+        <w:t xml:space="preserve"> linked to a master-regulator program; these are listed in Table 11. Taken together, ligand–receptor remodelling acts as the </w:t>
       </w:r>
       <w:r>
         <w:rPr>
@@ -7784,7 +7889,7 @@
           <w:i w:val="0"/>
           <w:sz w:val="22"/>
         </w:rPr>
-        <w:t xml:space="preserve"> whose downstream intracellular targets are coordinated by the same master regulators that drive the edge-level ΔW, unifying the communication and GRN-rewiring descriptions of the stroke response.</w:t>
+        <w:t xml:space="preserve"> whose downstream intracellular targets are coordinated by the same master regulators that drive the edge-level ΔW, so that the communication and GRN-rewiring views describe one stroke response from two angles.</w:t>
       </w:r>
     </w:p>
     <w:p>
@@ -9670,7 +9775,7 @@
           <w:i w:val="0"/>
           <w:sz w:val="22"/>
         </w:rPr>
-        <w:t xml:space="preserve"> master regulators drive it. A black-box linear or foundation-model readout compresses the perturbation to a single score and discards this structure. We therefore position TSC-GNN as a virtual-perturbation framework built around interpretability. The choice of DoRothEA over an undirected k-NN co-expression graph follows the same logic, the two are near-indifferent for prediction, but only the directed graph renders rewiring as an interpretable "whose regulation is enhanced/weakened" statement.</w:t>
+        <w:t xml:space="preserve"> master regulators drive it. A black-box linear or foundation-model readout compresses the perturbation to a single score and discards this structure. We therefore treat TSC-GNN as a virtual-perturbation framework built around interpretability. The choice of DoRothEA over an undirected k-NN co-expression graph follows the same logic, the two are near-indifferent for prediction, but only the directed graph renders rewiring as an interpretable "whose regulation is enhanced/weakened" statement.</w:t>
       </w:r>
     </w:p>
     <w:p>
@@ -9896,7 +10001,7 @@
           <w:i w:val="0"/>
           <w:sz w:val="22"/>
         </w:rPr>
-        <w:t xml:space="preserve">. We report the Jaccard ≈ 0 result, as the empirical basis for this insight and as a caution that single-edge GRN claims should be read as dataset-specific hypotheses, not universal discoveries. This aligns TSC-GNN with the module-level hypothesis-generation paradigm (SCENIC , NicheNet ) rather than with earlier edge-level causality claims that failed to sustain adoption </w:t>
+        <w:t xml:space="preserve">. We report the Jaccard ≈ 0 result, as the empirical basis for this insight and as a caution that single-edge GRN claims should be read as dataset-specific hypotheses, not universal discoveries. Read this way, TSC-GNN belongs to the module-level hypothesis-generation paradigm (SCENIC , NicheNet ) rather than to earlier edge-level causality claims that failed to sustain adoption </w:t>
       </w:r>
       <w:r>
         <w:rPr>
@@ -18706,7 +18811,7 @@
           <w:i w:val="0"/>
           <w:sz w:val="22"/>
         </w:rPr>
-        <w:t xml:space="preserve"> 24 h / 48 h cell–cell communication in GSE197731 (WT) and cross-cohort 24 h consistency. (A) Heatmap of log₂(ipsilateral/contralateral) communication score for the 38 significant 24 h WT ligand–receptor pairs. (B) Pathway-level convergence between the two 24 h cohorts (GSE174574 vs GSE197731_WT): 2 vs 14 pathways, 1 shared (Thrombospondin; pathway Jaccard = 0.07). (C) Sender→receiver cell-type convergence: 2 vs 25 significant cell-type pairs, 1 shared (Pericyte→Pericyte). Panels B/C show that cross-cohort agreement is meaningful at the pathway/cell-type resolution even though the LR-pair Jaccard is 0.00 (power asymmetry).</w:t>
+        <w:t xml:space="preserve"> 24 h / 48 h cell–cell communication in GSE197731 (WT) and cross-cohort 24 h consistency. (A) Heatmap of log₂(ipsilateral/contralateral) communication score for the 38 significant 24 h WT ligand–receptor pairs. (B) Pathway-level convergence between the two 24 h cohorts (GSE174574 vs GSE197731_WT): 2 vs 14 pathways, 1 shared (Thrombospondin; pathway Jaccard = 0.067). (C) Sender→receiver cell-type convergence: 2 vs 25 significant cell-type pairs, 1 shared (Pericyte→Pericyte). Panels B/C show that cross-cohort agreement is meaningful at the pathway/cell-type resolution even though the LR-pair Jaccard is 0.00 (power asymmetry).</w:t>
       </w:r>
     </w:p>
     <w:sectPr>

</xml_diff>